<commit_message>
fix(report): standardize KBBI diction, center signature header, adjust personnel table width, and fix photo detection
</commit_message>
<xml_diff>
--- a/app/templates/template_laporan_monev.docx
+++ b/app/templates/template_laporan_monev.docx
@@ -1791,754 +1791,686 @@
           <w:szCs w:val="22"/>
           <w:lang w:val="en-US"/>
         </w:rPr>
-        <w:t>Kegiatan</w:t>
-      </w:r>
-      <w:proofErr w:type="spellEnd"/>
-      <w:r>
-        <w:rPr>
-          <w:rFonts w:ascii="Arial" w:hAnsi="Arial" w:cs="Arial"/>
-          <w:color w:val="000000" w:themeColor="text1"/>
-          <w:sz w:val="22"/>
-          <w:szCs w:val="22"/>
-          <w:lang w:val="en-US"/>
-        </w:rPr>
-        <w:t xml:space="preserve"> Monitoring dan </w:t>
-      </w:r>
-      <w:proofErr w:type="spellStart"/>
-      <w:r>
-        <w:rPr>
-          <w:rFonts w:ascii="Arial" w:hAnsi="Arial" w:cs="Arial"/>
-          <w:color w:val="000000" w:themeColor="text1"/>
-          <w:sz w:val="22"/>
-          <w:szCs w:val="22"/>
-          <w:lang w:val="en-US"/>
-        </w:rPr>
-        <w:t>Evaluasi</w:t>
-      </w:r>
-      <w:proofErr w:type="spellEnd"/>
-      <w:r>
-        <w:rPr>
-          <w:rFonts w:ascii="Arial" w:hAnsi="Arial" w:cs="Arial"/>
-          <w:color w:val="000000" w:themeColor="text1"/>
-          <w:sz w:val="22"/>
-          <w:szCs w:val="22"/>
-          <w:lang w:val="en-US"/>
-        </w:rPr>
-        <w:t xml:space="preserve"> (</w:t>
-      </w:r>
-      <w:proofErr w:type="spellStart"/>
-      <w:r>
-        <w:rPr>
-          <w:rFonts w:ascii="Arial" w:hAnsi="Arial" w:cs="Arial"/>
-          <w:color w:val="000000" w:themeColor="text1"/>
-          <w:sz w:val="22"/>
-          <w:szCs w:val="22"/>
-          <w:lang w:val="en-US"/>
-        </w:rPr>
-        <w:t>Monev</w:t>
-      </w:r>
-      <w:proofErr w:type="spellEnd"/>
-      <w:r>
-        <w:rPr>
-          <w:rFonts w:ascii="Arial" w:hAnsi="Arial" w:cs="Arial"/>
-          <w:color w:val="000000" w:themeColor="text1"/>
-          <w:sz w:val="22"/>
-          <w:szCs w:val="22"/>
-          <w:lang w:val="en-US"/>
-        </w:rPr>
-        <w:t xml:space="preserve">) </w:t>
-      </w:r>
-      <w:proofErr w:type="spellStart"/>
-      <w:r>
-        <w:rPr>
-          <w:rFonts w:ascii="Arial" w:hAnsi="Arial" w:cs="Arial"/>
-          <w:color w:val="000000" w:themeColor="text1"/>
-          <w:sz w:val="22"/>
-          <w:szCs w:val="22"/>
-          <w:lang w:val="en-US"/>
-        </w:rPr>
-        <w:t>Pamsimas</w:t>
-      </w:r>
-      <w:proofErr w:type="spellEnd"/>
-      <w:r>
-        <w:rPr>
-          <w:rFonts w:ascii="Arial" w:hAnsi="Arial" w:cs="Arial"/>
-          <w:color w:val="000000" w:themeColor="text1"/>
-          <w:sz w:val="22"/>
-          <w:szCs w:val="22"/>
-          <w:lang w:val="en-US"/>
-        </w:rPr>
-        <w:t xml:space="preserve"> </w:t>
-      </w:r>
-      <w:proofErr w:type="spellStart"/>
-      <w:r>
-        <w:rPr>
-          <w:rFonts w:ascii="Arial" w:hAnsi="Arial" w:cs="Arial"/>
-          <w:color w:val="000000" w:themeColor="text1"/>
-          <w:sz w:val="22"/>
-          <w:szCs w:val="22"/>
-          <w:lang w:val="en-US"/>
-        </w:rPr>
-        <w:t>Tahun</w:t>
-      </w:r>
-      <w:proofErr w:type="spellEnd"/>
-      <w:r>
-        <w:rPr>
-          <w:rFonts w:ascii="Arial" w:hAnsi="Arial" w:cs="Arial"/>
-          <w:color w:val="000000" w:themeColor="text1"/>
-          <w:sz w:val="22"/>
-          <w:szCs w:val="22"/>
-          <w:lang w:val="en-US"/>
-        </w:rPr>
-        <w:t xml:space="preserve"> </w:t>
-      </w:r>
-      <w:proofErr w:type="spellStart"/>
-      <w:r>
-        <w:rPr>
-          <w:rFonts w:ascii="Arial" w:hAnsi="Arial" w:cs="Arial"/>
-          <w:color w:val="000000" w:themeColor="text1"/>
-          <w:sz w:val="22"/>
-          <w:szCs w:val="22"/>
-          <w:lang w:val="en-US"/>
-        </w:rPr>
-        <w:t>Anggaran</w:t>
-      </w:r>
-      <w:proofErr w:type="spellEnd"/>
-      <w:r>
-        <w:rPr>
-          <w:rFonts w:ascii="Arial" w:hAnsi="Arial" w:cs="Arial"/>
-          <w:color w:val="000000" w:themeColor="text1"/>
-          <w:sz w:val="22"/>
-          <w:szCs w:val="22"/>
-          <w:lang w:val="en-US"/>
-        </w:rPr>
-        <w:t xml:space="preserve"> 2026 di </w:t>
-      </w:r>
-      <w:proofErr w:type="spellStart"/>
-      <w:r>
-        <w:rPr>
-          <w:rFonts w:ascii="Arial" w:hAnsi="Arial" w:cs="Arial"/>
-          <w:color w:val="000000" w:themeColor="text1"/>
-          <w:sz w:val="22"/>
-          <w:szCs w:val="22"/>
-          <w:lang w:val="en-US"/>
-        </w:rPr>
-        <w:t>Kabupaten</w:t>
-      </w:r>
-      <w:proofErr w:type="spellEnd"/>
-      <w:r>
-        <w:rPr>
-          <w:rFonts w:ascii="Arial" w:hAnsi="Arial" w:cs="Arial"/>
-          <w:color w:val="000000" w:themeColor="text1"/>
-          <w:sz w:val="22"/>
-          <w:szCs w:val="22"/>
-          <w:lang w:val="en-US"/>
-        </w:rPr>
-        <w:t xml:space="preserve"> </w:t>
-      </w:r>
-      <w:proofErr w:type="spellStart"/>
-      <w:r>
-        <w:rPr>
-          <w:rFonts w:ascii="Arial" w:hAnsi="Arial" w:cs="Arial"/>
-          <w:color w:val="000000" w:themeColor="text1"/>
-          <w:sz w:val="22"/>
-          <w:szCs w:val="22"/>
-          <w:lang w:val="en-US"/>
-        </w:rPr>
-        <w:t>Magelang</w:t>
-      </w:r>
-      <w:proofErr w:type="spellEnd"/>
-      <w:r>
-        <w:rPr>
-          <w:rFonts w:ascii="Arial" w:hAnsi="Arial" w:cs="Arial"/>
-          <w:color w:val="000000" w:themeColor="text1"/>
-          <w:sz w:val="22"/>
-          <w:szCs w:val="22"/>
-          <w:lang w:val="en-US"/>
-        </w:rPr>
-        <w:t xml:space="preserve"> </w:t>
-      </w:r>
-      <w:proofErr w:type="spellStart"/>
-      <w:r>
-        <w:rPr>
-          <w:rFonts w:ascii="Arial" w:hAnsi="Arial" w:cs="Arial"/>
-          <w:color w:val="000000" w:themeColor="text1"/>
-          <w:sz w:val="22"/>
-          <w:szCs w:val="22"/>
-          <w:lang w:val="en-US"/>
-        </w:rPr>
-        <w:t>dilaksanakan</w:t>
-      </w:r>
-      <w:proofErr w:type="spellEnd"/>
-      <w:r>
-        <w:rPr>
-          <w:rFonts w:ascii="Arial" w:hAnsi="Arial" w:cs="Arial"/>
-          <w:color w:val="000000" w:themeColor="text1"/>
-          <w:sz w:val="22"/>
-          <w:szCs w:val="22"/>
-          <w:lang w:val="en-US"/>
-        </w:rPr>
-        <w:t xml:space="preserve"> </w:t>
-      </w:r>
-      <w:proofErr w:type="spellStart"/>
-      <w:r>
-        <w:rPr>
-          <w:rFonts w:ascii="Arial" w:hAnsi="Arial" w:cs="Arial"/>
-          <w:color w:val="000000" w:themeColor="text1"/>
-          <w:sz w:val="22"/>
-          <w:szCs w:val="22"/>
-          <w:lang w:val="en-US"/>
-        </w:rPr>
-        <w:t>untuk</w:t>
-      </w:r>
-      <w:proofErr w:type="spellEnd"/>
-      <w:r>
-        <w:rPr>
-          <w:rFonts w:ascii="Arial" w:hAnsi="Arial" w:cs="Arial"/>
-          <w:color w:val="000000" w:themeColor="text1"/>
-          <w:sz w:val="22"/>
-          <w:szCs w:val="22"/>
-          <w:lang w:val="en-US"/>
-        </w:rPr>
-        <w:t xml:space="preserve"> </w:t>
-      </w:r>
-      <w:proofErr w:type="spellStart"/>
-      <w:r>
-        <w:rPr>
-          <w:rFonts w:ascii="Arial" w:hAnsi="Arial" w:cs="Arial"/>
-          <w:color w:val="000000" w:themeColor="text1"/>
-          <w:sz w:val="22"/>
-          <w:szCs w:val="22"/>
-          <w:lang w:val="en-US"/>
-        </w:rPr>
-        <w:t>memperoleh</w:t>
-      </w:r>
-      <w:proofErr w:type="spellEnd"/>
-      <w:r>
-        <w:rPr>
-          <w:rFonts w:ascii="Arial" w:hAnsi="Arial" w:cs="Arial"/>
-          <w:color w:val="000000" w:themeColor="text1"/>
-          <w:sz w:val="22"/>
-          <w:szCs w:val="22"/>
-          <w:lang w:val="en-US"/>
-        </w:rPr>
-        <w:t xml:space="preserve"> </w:t>
-      </w:r>
-      <w:proofErr w:type="spellStart"/>
-      <w:r>
-        <w:rPr>
-          <w:rFonts w:ascii="Arial" w:hAnsi="Arial" w:cs="Arial"/>
-          <w:color w:val="000000" w:themeColor="text1"/>
-          <w:sz w:val="22"/>
-          <w:szCs w:val="22"/>
-          <w:lang w:val="en-US"/>
-        </w:rPr>
-        <w:t>gambaran</w:t>
-      </w:r>
-      <w:proofErr w:type="spellEnd"/>
-      <w:r>
-        <w:rPr>
-          <w:rFonts w:ascii="Arial" w:hAnsi="Arial" w:cs="Arial"/>
-          <w:color w:val="000000" w:themeColor="text1"/>
-          <w:sz w:val="22"/>
-          <w:szCs w:val="22"/>
-          <w:lang w:val="en-US"/>
-        </w:rPr>
-        <w:t xml:space="preserve"> </w:t>
-      </w:r>
-      <w:proofErr w:type="spellStart"/>
-      <w:r>
-        <w:rPr>
-          <w:rFonts w:ascii="Arial" w:hAnsi="Arial" w:cs="Arial"/>
-          <w:color w:val="000000" w:themeColor="text1"/>
-          <w:sz w:val="22"/>
-          <w:szCs w:val="22"/>
-          <w:lang w:val="en-US"/>
-        </w:rPr>
-        <w:t>kondisi</w:t>
-      </w:r>
-      <w:proofErr w:type="spellEnd"/>
-      <w:r>
-        <w:rPr>
-          <w:rFonts w:ascii="Arial" w:hAnsi="Arial" w:cs="Arial"/>
-          <w:color w:val="000000" w:themeColor="text1"/>
-          <w:sz w:val="22"/>
-          <w:szCs w:val="22"/>
-          <w:lang w:val="en-US"/>
-        </w:rPr>
-        <w:t xml:space="preserve"> dan </w:t>
-      </w:r>
-      <w:proofErr w:type="spellStart"/>
-      <w:r>
-        <w:rPr>
-          <w:rFonts w:ascii="Arial" w:hAnsi="Arial" w:cs="Arial"/>
-          <w:color w:val="000000" w:themeColor="text1"/>
-          <w:sz w:val="22"/>
-          <w:szCs w:val="22"/>
-          <w:lang w:val="en-US"/>
-        </w:rPr>
-        <w:t>kemajuan</w:t>
-      </w:r>
-      <w:proofErr w:type="spellEnd"/>
-      <w:r>
-        <w:rPr>
-          <w:rFonts w:ascii="Arial" w:hAnsi="Arial" w:cs="Arial"/>
-          <w:color w:val="000000" w:themeColor="text1"/>
-          <w:sz w:val="22"/>
-          <w:szCs w:val="22"/>
-          <w:lang w:val="en-US"/>
-        </w:rPr>
-        <w:t xml:space="preserve"> </w:t>
-      </w:r>
-      <w:proofErr w:type="spellStart"/>
-      <w:r>
-        <w:rPr>
-          <w:rFonts w:ascii="Arial" w:hAnsi="Arial" w:cs="Arial"/>
-          <w:color w:val="000000" w:themeColor="text1"/>
-          <w:sz w:val="22"/>
-          <w:szCs w:val="22"/>
-          <w:lang w:val="en-US"/>
-        </w:rPr>
-        <w:t>pelaksanaan</w:t>
-      </w:r>
-      <w:proofErr w:type="spellEnd"/>
-      <w:r>
-        <w:rPr>
-          <w:rFonts w:ascii="Arial" w:hAnsi="Arial" w:cs="Arial"/>
-          <w:color w:val="000000" w:themeColor="text1"/>
-          <w:sz w:val="22"/>
-          <w:szCs w:val="22"/>
-          <w:lang w:val="en-US"/>
-        </w:rPr>
-        <w:t xml:space="preserve"> </w:t>
-      </w:r>
-      <w:proofErr w:type="spellStart"/>
-      <w:r>
-        <w:rPr>
-          <w:rFonts w:ascii="Arial" w:hAnsi="Arial" w:cs="Arial"/>
-          <w:color w:val="000000" w:themeColor="text1"/>
-          <w:sz w:val="22"/>
-          <w:szCs w:val="22"/>
-          <w:lang w:val="en-US"/>
-        </w:rPr>
-        <w:t>kegiatan</w:t>
-      </w:r>
-      <w:proofErr w:type="spellEnd"/>
-      <w:r>
-        <w:rPr>
-          <w:rFonts w:ascii="Arial" w:hAnsi="Arial" w:cs="Arial"/>
-          <w:color w:val="000000" w:themeColor="text1"/>
-          <w:sz w:val="22"/>
-          <w:szCs w:val="22"/>
-          <w:lang w:val="en-US"/>
-        </w:rPr>
-        <w:t xml:space="preserve"> di </w:t>
-      </w:r>
-      <w:proofErr w:type="spellStart"/>
-      <w:r>
-        <w:rPr>
-          <w:rFonts w:ascii="Arial" w:hAnsi="Arial" w:cs="Arial"/>
-          <w:color w:val="000000" w:themeColor="text1"/>
-          <w:sz w:val="22"/>
-          <w:szCs w:val="22"/>
-          <w:lang w:val="en-US"/>
-        </w:rPr>
-        <w:t>tingkat</w:t>
-      </w:r>
-      <w:proofErr w:type="spellEnd"/>
-      <w:r>
-        <w:rPr>
-          <w:rFonts w:ascii="Arial" w:hAnsi="Arial" w:cs="Arial"/>
-          <w:color w:val="000000" w:themeColor="text1"/>
-          <w:sz w:val="22"/>
-          <w:szCs w:val="22"/>
-          <w:lang w:val="en-US"/>
-        </w:rPr>
-        <w:t xml:space="preserve"> </w:t>
-      </w:r>
-      <w:proofErr w:type="spellStart"/>
-      <w:r>
-        <w:rPr>
-          <w:rFonts w:ascii="Arial" w:hAnsi="Arial" w:cs="Arial"/>
-          <w:color w:val="000000" w:themeColor="text1"/>
-          <w:sz w:val="22"/>
-          <w:szCs w:val="22"/>
-          <w:lang w:val="en-US"/>
-        </w:rPr>
-        <w:t>desa</w:t>
-      </w:r>
-      <w:proofErr w:type="spellEnd"/>
-      <w:r>
-        <w:rPr>
-          <w:rFonts w:ascii="Arial" w:hAnsi="Arial" w:cs="Arial"/>
-          <w:color w:val="000000" w:themeColor="text1"/>
-          <w:sz w:val="22"/>
-          <w:szCs w:val="22"/>
-          <w:lang w:val="en-US"/>
-        </w:rPr>
-        <w:t xml:space="preserve"> (</w:t>
-      </w:r>
-      <w:proofErr w:type="spellStart"/>
-      <w:r>
-        <w:rPr>
-          <w:rFonts w:ascii="Arial" w:hAnsi="Arial" w:cs="Arial"/>
-          <w:color w:val="000000" w:themeColor="text1"/>
-          <w:sz w:val="22"/>
-          <w:szCs w:val="22"/>
-          <w:lang w:val="en-US"/>
-        </w:rPr>
-        <w:t>Baleagung</w:t>
-      </w:r>
-      <w:proofErr w:type="spellEnd"/>
-      <w:r>
-        <w:rPr>
-          <w:rFonts w:ascii="Arial" w:hAnsi="Arial" w:cs="Arial"/>
-          <w:color w:val="000000" w:themeColor="text1"/>
-          <w:sz w:val="22"/>
-          <w:szCs w:val="22"/>
-          <w:lang w:val="en-US"/>
-        </w:rPr>
-        <w:t xml:space="preserve"> </w:t>
-      </w:r>
-      <w:proofErr w:type="spellStart"/>
-      <w:r>
-        <w:rPr>
-          <w:rFonts w:ascii="Arial" w:hAnsi="Arial" w:cs="Arial"/>
-          <w:color w:val="000000" w:themeColor="text1"/>
-          <w:sz w:val="22"/>
-          <w:szCs w:val="22"/>
-          <w:lang w:val="en-US"/>
-        </w:rPr>
-        <w:t>Kec</w:t>
-      </w:r>
-      <w:proofErr w:type="spellEnd"/>
-      <w:r>
-        <w:rPr>
-          <w:rFonts w:ascii="Arial" w:hAnsi="Arial" w:cs="Arial"/>
-          <w:color w:val="000000" w:themeColor="text1"/>
-          <w:sz w:val="22"/>
-          <w:szCs w:val="22"/>
-          <w:lang w:val="en-US"/>
-        </w:rPr>
-        <w:t xml:space="preserve">. </w:t>
-      </w:r>
-      <w:proofErr w:type="spellStart"/>
-      <w:r>
-        <w:rPr>
-          <w:rFonts w:ascii="Arial" w:hAnsi="Arial" w:cs="Arial"/>
-          <w:color w:val="000000" w:themeColor="text1"/>
-          <w:sz w:val="22"/>
-          <w:szCs w:val="22"/>
-          <w:lang w:val="en-US"/>
-        </w:rPr>
-        <w:t>Grabag</w:t>
-      </w:r>
-      <w:proofErr w:type="spellEnd"/>
-      <w:r>
-        <w:rPr>
-          <w:rFonts w:ascii="Arial" w:hAnsi="Arial" w:cs="Arial"/>
-          <w:color w:val="000000" w:themeColor="text1"/>
-          <w:sz w:val="22"/>
-          <w:szCs w:val="22"/>
-          <w:lang w:val="en-US"/>
-        </w:rPr>
-        <w:t>)</w:t>
-      </w:r>
-      <w:r>
-        <w:rPr>
-          <w:rFonts w:ascii="Arial" w:hAnsi="Arial" w:cs="Arial"/>
-          <w:color w:val="000000" w:themeColor="text1"/>
-          <w:sz w:val="22"/>
-          <w:szCs w:val="22"/>
-          <w:lang w:val="en-US"/>
-        </w:rPr>
-        <w:t xml:space="preserve">, </w:t>
-      </w:r>
-      <w:proofErr w:type="spellStart"/>
-      <w:r>
-        <w:rPr>
-          <w:rFonts w:ascii="Arial" w:hAnsi="Arial" w:cs="Arial"/>
-          <w:color w:val="000000" w:themeColor="text1"/>
-          <w:sz w:val="22"/>
-          <w:szCs w:val="22"/>
-          <w:lang w:val="en-US"/>
-        </w:rPr>
-        <w:t>mengidentifikasi</w:t>
-      </w:r>
-      <w:proofErr w:type="spellEnd"/>
-      <w:r>
-        <w:rPr>
-          <w:rFonts w:ascii="Arial" w:hAnsi="Arial" w:cs="Arial"/>
-          <w:color w:val="000000" w:themeColor="text1"/>
-          <w:sz w:val="22"/>
-          <w:szCs w:val="22"/>
-          <w:lang w:val="en-US"/>
-        </w:rPr>
-        <w:t xml:space="preserve"> </w:t>
-      </w:r>
-      <w:proofErr w:type="spellStart"/>
-      <w:r>
-        <w:rPr>
-          <w:rFonts w:ascii="Arial" w:hAnsi="Arial" w:cs="Arial"/>
-          <w:color w:val="000000" w:themeColor="text1"/>
-          <w:sz w:val="22"/>
-          <w:szCs w:val="22"/>
-          <w:lang w:val="en-US"/>
-        </w:rPr>
-        <w:t>permasalahan</w:t>
-      </w:r>
-      <w:proofErr w:type="spellEnd"/>
-      <w:r>
-        <w:rPr>
-          <w:rFonts w:ascii="Arial" w:hAnsi="Arial" w:cs="Arial"/>
-          <w:color w:val="000000" w:themeColor="text1"/>
-          <w:sz w:val="22"/>
-          <w:szCs w:val="22"/>
-          <w:lang w:val="en-US"/>
-        </w:rPr>
-        <w:t xml:space="preserve"> yang </w:t>
-      </w:r>
-      <w:proofErr w:type="spellStart"/>
-      <w:r>
-        <w:rPr>
-          <w:rFonts w:ascii="Arial" w:hAnsi="Arial" w:cs="Arial"/>
-          <w:color w:val="000000" w:themeColor="text1"/>
-          <w:sz w:val="22"/>
-          <w:szCs w:val="22"/>
-          <w:lang w:val="en-US"/>
-        </w:rPr>
-        <w:t>dihadapi</w:t>
-      </w:r>
-      <w:proofErr w:type="spellEnd"/>
-      <w:r>
-        <w:rPr>
-          <w:rFonts w:ascii="Arial" w:hAnsi="Arial" w:cs="Arial"/>
-          <w:color w:val="000000" w:themeColor="text1"/>
-          <w:sz w:val="22"/>
-          <w:szCs w:val="22"/>
-          <w:lang w:val="en-US"/>
-        </w:rPr>
-        <w:t xml:space="preserve">, </w:t>
-      </w:r>
-      <w:proofErr w:type="spellStart"/>
-      <w:r>
-        <w:rPr>
-          <w:rFonts w:ascii="Arial" w:hAnsi="Arial" w:cs="Arial"/>
-          <w:color w:val="000000" w:themeColor="text1"/>
-          <w:sz w:val="22"/>
-          <w:szCs w:val="22"/>
-          <w:lang w:val="en-US"/>
-        </w:rPr>
-        <w:t>serta</w:t>
-      </w:r>
-      <w:proofErr w:type="spellEnd"/>
-      <w:r>
-        <w:rPr>
-          <w:rFonts w:ascii="Arial" w:hAnsi="Arial" w:cs="Arial"/>
-          <w:color w:val="000000" w:themeColor="text1"/>
-          <w:sz w:val="22"/>
-          <w:szCs w:val="22"/>
-          <w:lang w:val="en-US"/>
-        </w:rPr>
-        <w:t xml:space="preserve"> </w:t>
-      </w:r>
-      <w:proofErr w:type="spellStart"/>
-      <w:r>
-        <w:rPr>
-          <w:rFonts w:ascii="Arial" w:hAnsi="Arial" w:cs="Arial"/>
-          <w:color w:val="000000" w:themeColor="text1"/>
-          <w:sz w:val="22"/>
-          <w:szCs w:val="22"/>
-          <w:lang w:val="en-US"/>
-        </w:rPr>
-        <w:t>memastikan</w:t>
-      </w:r>
-      <w:proofErr w:type="spellEnd"/>
-      <w:r>
-        <w:rPr>
-          <w:rFonts w:ascii="Arial" w:hAnsi="Arial" w:cs="Arial"/>
-          <w:color w:val="000000" w:themeColor="text1"/>
-          <w:sz w:val="22"/>
-          <w:szCs w:val="22"/>
-          <w:lang w:val="en-US"/>
-        </w:rPr>
-        <w:t xml:space="preserve"> </w:t>
-      </w:r>
-      <w:proofErr w:type="spellStart"/>
-      <w:r>
-        <w:rPr>
-          <w:rFonts w:ascii="Arial" w:hAnsi="Arial" w:cs="Arial"/>
-          <w:color w:val="000000" w:themeColor="text1"/>
-          <w:sz w:val="22"/>
-          <w:szCs w:val="22"/>
-          <w:lang w:val="en-US"/>
-        </w:rPr>
-        <w:t>pelaksanaan</w:t>
-      </w:r>
-      <w:proofErr w:type="spellEnd"/>
-      <w:r>
-        <w:rPr>
-          <w:rFonts w:ascii="Arial" w:hAnsi="Arial" w:cs="Arial"/>
-          <w:color w:val="000000" w:themeColor="text1"/>
-          <w:sz w:val="22"/>
-          <w:szCs w:val="22"/>
-          <w:lang w:val="en-US"/>
-        </w:rPr>
-        <w:t xml:space="preserve"> </w:t>
-      </w:r>
-      <w:proofErr w:type="spellStart"/>
-      <w:r>
-        <w:rPr>
-          <w:rFonts w:ascii="Arial" w:hAnsi="Arial" w:cs="Arial"/>
-          <w:color w:val="000000" w:themeColor="text1"/>
-          <w:sz w:val="22"/>
-          <w:szCs w:val="22"/>
-          <w:lang w:val="en-US"/>
-        </w:rPr>
-        <w:t>kegiatan</w:t>
-      </w:r>
-      <w:proofErr w:type="spellEnd"/>
-      <w:r>
-        <w:rPr>
-          <w:rFonts w:ascii="Arial" w:hAnsi="Arial" w:cs="Arial"/>
-          <w:color w:val="000000" w:themeColor="text1"/>
-          <w:sz w:val="22"/>
-          <w:szCs w:val="22"/>
-          <w:lang w:val="en-US"/>
-        </w:rPr>
-        <w:t xml:space="preserve"> </w:t>
-      </w:r>
-      <w:proofErr w:type="spellStart"/>
-      <w:r>
-        <w:rPr>
-          <w:rFonts w:ascii="Arial" w:hAnsi="Arial" w:cs="Arial"/>
-          <w:color w:val="000000" w:themeColor="text1"/>
-          <w:sz w:val="22"/>
-          <w:szCs w:val="22"/>
-          <w:lang w:val="en-US"/>
-        </w:rPr>
-        <w:t>tetap</w:t>
-      </w:r>
-      <w:proofErr w:type="spellEnd"/>
-      <w:r>
-        <w:rPr>
-          <w:rFonts w:ascii="Arial" w:hAnsi="Arial" w:cs="Arial"/>
-          <w:color w:val="000000" w:themeColor="text1"/>
-          <w:sz w:val="22"/>
-          <w:szCs w:val="22"/>
-          <w:lang w:val="en-US"/>
-        </w:rPr>
-        <w:t xml:space="preserve"> </w:t>
-      </w:r>
-      <w:proofErr w:type="spellStart"/>
-      <w:r>
-        <w:rPr>
-          <w:rFonts w:ascii="Arial" w:hAnsi="Arial" w:cs="Arial"/>
-          <w:color w:val="000000" w:themeColor="text1"/>
-          <w:sz w:val="22"/>
-          <w:szCs w:val="22"/>
-          <w:lang w:val="en-US"/>
-        </w:rPr>
-        <w:t>sesuai</w:t>
-      </w:r>
-      <w:proofErr w:type="spellEnd"/>
-      <w:r>
-        <w:rPr>
-          <w:rFonts w:ascii="Arial" w:hAnsi="Arial" w:cs="Arial"/>
-          <w:color w:val="000000" w:themeColor="text1"/>
-          <w:sz w:val="22"/>
-          <w:szCs w:val="22"/>
-          <w:lang w:val="en-US"/>
-        </w:rPr>
-        <w:t xml:space="preserve"> </w:t>
-      </w:r>
-      <w:proofErr w:type="spellStart"/>
-      <w:r>
-        <w:rPr>
-          <w:rFonts w:ascii="Arial" w:hAnsi="Arial" w:cs="Arial"/>
-          <w:color w:val="000000" w:themeColor="text1"/>
-          <w:sz w:val="22"/>
-          <w:szCs w:val="22"/>
-          <w:lang w:val="en-US"/>
-        </w:rPr>
-        <w:t>dengan</w:t>
-      </w:r>
-      <w:proofErr w:type="spellEnd"/>
-      <w:r>
-        <w:rPr>
-          <w:rFonts w:ascii="Arial" w:hAnsi="Arial" w:cs="Arial"/>
-          <w:color w:val="000000" w:themeColor="text1"/>
-          <w:sz w:val="22"/>
-          <w:szCs w:val="22"/>
-          <w:lang w:val="en-US"/>
-        </w:rPr>
-        <w:t xml:space="preserve"> target dan </w:t>
-      </w:r>
-      <w:proofErr w:type="spellStart"/>
-      <w:r>
-        <w:rPr>
-          <w:rFonts w:ascii="Arial" w:hAnsi="Arial" w:cs="Arial"/>
-          <w:color w:val="000000" w:themeColor="text1"/>
-          <w:sz w:val="22"/>
-          <w:szCs w:val="22"/>
-          <w:lang w:val="en-US"/>
-        </w:rPr>
-        <w:t>ketentuan</w:t>
-      </w:r>
-      <w:proofErr w:type="spellEnd"/>
-      <w:r>
-        <w:rPr>
-          <w:rFonts w:ascii="Arial" w:hAnsi="Arial" w:cs="Arial"/>
-          <w:color w:val="000000" w:themeColor="text1"/>
-          <w:sz w:val="22"/>
-          <w:szCs w:val="22"/>
-          <w:lang w:val="en-US"/>
-        </w:rPr>
-        <w:t xml:space="preserve"> yang </w:t>
-      </w:r>
-      <w:proofErr w:type="spellStart"/>
-      <w:r>
-        <w:rPr>
-          <w:rFonts w:ascii="Arial" w:hAnsi="Arial" w:cs="Arial"/>
-          <w:color w:val="000000" w:themeColor="text1"/>
-          <w:sz w:val="22"/>
-          <w:szCs w:val="22"/>
-          <w:lang w:val="en-US"/>
-        </w:rPr>
-        <w:t>telah</w:t>
-      </w:r>
-      <w:proofErr w:type="spellEnd"/>
-      <w:r>
-        <w:rPr>
-          <w:rFonts w:ascii="Arial" w:hAnsi="Arial" w:cs="Arial"/>
-          <w:color w:val="000000" w:themeColor="text1"/>
-          <w:sz w:val="22"/>
-          <w:szCs w:val="22"/>
-          <w:lang w:val="en-US"/>
-        </w:rPr>
-        <w:t xml:space="preserve"> </w:t>
-      </w:r>
-      <w:proofErr w:type="spellStart"/>
-      <w:r>
-        <w:rPr>
-          <w:rFonts w:ascii="Arial" w:hAnsi="Arial" w:cs="Arial"/>
-          <w:color w:val="000000" w:themeColor="text1"/>
-          <w:sz w:val="22"/>
-          <w:szCs w:val="22"/>
-          <w:lang w:val="en-US"/>
-        </w:rPr>
-        <w:t>ditetapkan</w:t>
-      </w:r>
-      <w:proofErr w:type="spellEnd"/>
-      <w:r>
-        <w:rPr>
-          <w:rFonts w:ascii="Arial" w:hAnsi="Arial" w:cs="Arial"/>
-          <w:color w:val="000000" w:themeColor="text1"/>
-          <w:sz w:val="22"/>
-          <w:szCs w:val="22"/>
-          <w:lang w:val="en-US"/>
-        </w:rPr>
-        <w:t>.</w:t>
+        <w:t>Kegiatan Monitoring dan Evaluasi (Monev) Pamsimas Tahun Anggaran 2026 di Kabupaten Magelang dilaksanakan untuk memperoleh gambaran kondisi dan kemajuan pelaksanaan kegiatan di tingkat desa (Desa Baleagung, Kecamatan Grabag), mengidentifikasi permasalahan yang dihadapi, serta memastikan pelaksanaan kegiatan tetap sesuai dengan target dan ketentuan yang telah ditetapkan.</w:t>
+      </w:r>
+      <w:proofErr w:type="spellEnd"/>
+      <w:r>
+        <w:rPr>
+          <w:rFonts w:ascii="Arial" w:hAnsi="Arial" w:cs="Arial"/>
+          <w:color w:val="000000" w:themeColor="text1"/>
+          <w:sz w:val="22"/>
+          <w:szCs w:val="22"/>
+          <w:lang w:val="en-US"/>
+        </w:rPr>
+      </w:r>
+      <w:proofErr w:type="spellStart"/>
+      <w:r>
+        <w:rPr>
+          <w:rFonts w:ascii="Arial" w:hAnsi="Arial" w:cs="Arial"/>
+          <w:color w:val="000000" w:themeColor="text1"/>
+          <w:sz w:val="22"/>
+          <w:szCs w:val="22"/>
+          <w:lang w:val="en-US"/>
+        </w:rPr>
+      </w:r>
+      <w:proofErr w:type="spellEnd"/>
+      <w:r>
+        <w:rPr>
+          <w:rFonts w:ascii="Arial" w:hAnsi="Arial" w:cs="Arial"/>
+          <w:color w:val="000000" w:themeColor="text1"/>
+          <w:sz w:val="22"/>
+          <w:szCs w:val="22"/>
+          <w:lang w:val="en-US"/>
+        </w:rPr>
+      </w:r>
+      <w:proofErr w:type="spellStart"/>
+      <w:r>
+        <w:rPr>
+          <w:rFonts w:ascii="Arial" w:hAnsi="Arial" w:cs="Arial"/>
+          <w:color w:val="000000" w:themeColor="text1"/>
+          <w:sz w:val="22"/>
+          <w:szCs w:val="22"/>
+          <w:lang w:val="en-US"/>
+        </w:rPr>
+      </w:r>
+      <w:proofErr w:type="spellEnd"/>
+      <w:r>
+        <w:rPr>
+          <w:rFonts w:ascii="Arial" w:hAnsi="Arial" w:cs="Arial"/>
+          <w:color w:val="000000" w:themeColor="text1"/>
+          <w:sz w:val="22"/>
+          <w:szCs w:val="22"/>
+          <w:lang w:val="en-US"/>
+        </w:rPr>
+      </w:r>
+      <w:proofErr w:type="spellStart"/>
+      <w:r>
+        <w:rPr>
+          <w:rFonts w:ascii="Arial" w:hAnsi="Arial" w:cs="Arial"/>
+          <w:color w:val="000000" w:themeColor="text1"/>
+          <w:sz w:val="22"/>
+          <w:szCs w:val="22"/>
+          <w:lang w:val="en-US"/>
+        </w:rPr>
+      </w:r>
+      <w:proofErr w:type="spellEnd"/>
+      <w:r>
+        <w:rPr>
+          <w:rFonts w:ascii="Arial" w:hAnsi="Arial" w:cs="Arial"/>
+          <w:color w:val="000000" w:themeColor="text1"/>
+          <w:sz w:val="22"/>
+          <w:szCs w:val="22"/>
+          <w:lang w:val="en-US"/>
+        </w:rPr>
+      </w:r>
+      <w:proofErr w:type="spellStart"/>
+      <w:r>
+        <w:rPr>
+          <w:rFonts w:ascii="Arial" w:hAnsi="Arial" w:cs="Arial"/>
+          <w:color w:val="000000" w:themeColor="text1"/>
+          <w:sz w:val="22"/>
+          <w:szCs w:val="22"/>
+          <w:lang w:val="en-US"/>
+        </w:rPr>
+      </w:r>
+      <w:proofErr w:type="spellEnd"/>
+      <w:r>
+        <w:rPr>
+          <w:rFonts w:ascii="Arial" w:hAnsi="Arial" w:cs="Arial"/>
+          <w:color w:val="000000" w:themeColor="text1"/>
+          <w:sz w:val="22"/>
+          <w:szCs w:val="22"/>
+          <w:lang w:val="en-US"/>
+        </w:rPr>
+      </w:r>
+      <w:proofErr w:type="spellStart"/>
+      <w:r>
+        <w:rPr>
+          <w:rFonts w:ascii="Arial" w:hAnsi="Arial" w:cs="Arial"/>
+          <w:color w:val="000000" w:themeColor="text1"/>
+          <w:sz w:val="22"/>
+          <w:szCs w:val="22"/>
+          <w:lang w:val="en-US"/>
+        </w:rPr>
+      </w:r>
+      <w:proofErr w:type="spellEnd"/>
+      <w:r>
+        <w:rPr>
+          <w:rFonts w:ascii="Arial" w:hAnsi="Arial" w:cs="Arial"/>
+          <w:color w:val="000000" w:themeColor="text1"/>
+          <w:sz w:val="22"/>
+          <w:szCs w:val="22"/>
+          <w:lang w:val="en-US"/>
+        </w:rPr>
+      </w:r>
+      <w:proofErr w:type="spellStart"/>
+      <w:r>
+        <w:rPr>
+          <w:rFonts w:ascii="Arial" w:hAnsi="Arial" w:cs="Arial"/>
+          <w:color w:val="000000" w:themeColor="text1"/>
+          <w:sz w:val="22"/>
+          <w:szCs w:val="22"/>
+          <w:lang w:val="en-US"/>
+        </w:rPr>
+      </w:r>
+      <w:proofErr w:type="spellEnd"/>
+      <w:r>
+        <w:rPr>
+          <w:rFonts w:ascii="Arial" w:hAnsi="Arial" w:cs="Arial"/>
+          <w:color w:val="000000" w:themeColor="text1"/>
+          <w:sz w:val="22"/>
+          <w:szCs w:val="22"/>
+          <w:lang w:val="en-US"/>
+        </w:rPr>
+      </w:r>
+      <w:proofErr w:type="spellStart"/>
+      <w:r>
+        <w:rPr>
+          <w:rFonts w:ascii="Arial" w:hAnsi="Arial" w:cs="Arial"/>
+          <w:color w:val="000000" w:themeColor="text1"/>
+          <w:sz w:val="22"/>
+          <w:szCs w:val="22"/>
+          <w:lang w:val="en-US"/>
+        </w:rPr>
+      </w:r>
+      <w:proofErr w:type="spellEnd"/>
+      <w:r>
+        <w:rPr>
+          <w:rFonts w:ascii="Arial" w:hAnsi="Arial" w:cs="Arial"/>
+          <w:color w:val="000000" w:themeColor="text1"/>
+          <w:sz w:val="22"/>
+          <w:szCs w:val="22"/>
+          <w:lang w:val="en-US"/>
+        </w:rPr>
+      </w:r>
+      <w:proofErr w:type="spellStart"/>
+      <w:r>
+        <w:rPr>
+          <w:rFonts w:ascii="Arial" w:hAnsi="Arial" w:cs="Arial"/>
+          <w:color w:val="000000" w:themeColor="text1"/>
+          <w:sz w:val="22"/>
+          <w:szCs w:val="22"/>
+          <w:lang w:val="en-US"/>
+        </w:rPr>
+      </w:r>
+      <w:proofErr w:type="spellEnd"/>
+      <w:r>
+        <w:rPr>
+          <w:rFonts w:ascii="Arial" w:hAnsi="Arial" w:cs="Arial"/>
+          <w:color w:val="000000" w:themeColor="text1"/>
+          <w:sz w:val="22"/>
+          <w:szCs w:val="22"/>
+          <w:lang w:val="en-US"/>
+        </w:rPr>
+      </w:r>
+      <w:proofErr w:type="spellStart"/>
+      <w:r>
+        <w:rPr>
+          <w:rFonts w:ascii="Arial" w:hAnsi="Arial" w:cs="Arial"/>
+          <w:color w:val="000000" w:themeColor="text1"/>
+          <w:sz w:val="22"/>
+          <w:szCs w:val="22"/>
+          <w:lang w:val="en-US"/>
+        </w:rPr>
+      </w:r>
+      <w:proofErr w:type="spellEnd"/>
+      <w:r>
+        <w:rPr>
+          <w:rFonts w:ascii="Arial" w:hAnsi="Arial" w:cs="Arial"/>
+          <w:color w:val="000000" w:themeColor="text1"/>
+          <w:sz w:val="22"/>
+          <w:szCs w:val="22"/>
+          <w:lang w:val="en-US"/>
+        </w:rPr>
+      </w:r>
+      <w:proofErr w:type="spellStart"/>
+      <w:r>
+        <w:rPr>
+          <w:rFonts w:ascii="Arial" w:hAnsi="Arial" w:cs="Arial"/>
+          <w:color w:val="000000" w:themeColor="text1"/>
+          <w:sz w:val="22"/>
+          <w:szCs w:val="22"/>
+          <w:lang w:val="en-US"/>
+        </w:rPr>
+      </w:r>
+      <w:proofErr w:type="spellEnd"/>
+      <w:r>
+        <w:rPr>
+          <w:rFonts w:ascii="Arial" w:hAnsi="Arial" w:cs="Arial"/>
+          <w:color w:val="000000" w:themeColor="text1"/>
+          <w:sz w:val="22"/>
+          <w:szCs w:val="22"/>
+          <w:lang w:val="en-US"/>
+        </w:rPr>
+      </w:r>
+      <w:proofErr w:type="spellStart"/>
+      <w:r>
+        <w:rPr>
+          <w:rFonts w:ascii="Arial" w:hAnsi="Arial" w:cs="Arial"/>
+          <w:color w:val="000000" w:themeColor="text1"/>
+          <w:sz w:val="22"/>
+          <w:szCs w:val="22"/>
+          <w:lang w:val="en-US"/>
+        </w:rPr>
+      </w:r>
+      <w:proofErr w:type="spellEnd"/>
+      <w:r>
+        <w:rPr>
+          <w:rFonts w:ascii="Arial" w:hAnsi="Arial" w:cs="Arial"/>
+          <w:color w:val="000000" w:themeColor="text1"/>
+          <w:sz w:val="22"/>
+          <w:szCs w:val="22"/>
+          <w:lang w:val="en-US"/>
+        </w:rPr>
+      </w:r>
+      <w:proofErr w:type="spellStart"/>
+      <w:r>
+        <w:rPr>
+          <w:rFonts w:ascii="Arial" w:hAnsi="Arial" w:cs="Arial"/>
+          <w:color w:val="000000" w:themeColor="text1"/>
+          <w:sz w:val="22"/>
+          <w:szCs w:val="22"/>
+          <w:lang w:val="en-US"/>
+        </w:rPr>
+      </w:r>
+      <w:proofErr w:type="spellEnd"/>
+      <w:r>
+        <w:rPr>
+          <w:rFonts w:ascii="Arial" w:hAnsi="Arial" w:cs="Arial"/>
+          <w:color w:val="000000" w:themeColor="text1"/>
+          <w:sz w:val="22"/>
+          <w:szCs w:val="22"/>
+          <w:lang w:val="en-US"/>
+        </w:rPr>
+      </w:r>
+      <w:proofErr w:type="spellStart"/>
+      <w:r>
+        <w:rPr>
+          <w:rFonts w:ascii="Arial" w:hAnsi="Arial" w:cs="Arial"/>
+          <w:color w:val="000000" w:themeColor="text1"/>
+          <w:sz w:val="22"/>
+          <w:szCs w:val="22"/>
+          <w:lang w:val="en-US"/>
+        </w:rPr>
+      </w:r>
+      <w:proofErr w:type="spellEnd"/>
+      <w:r>
+        <w:rPr>
+          <w:rFonts w:ascii="Arial" w:hAnsi="Arial" w:cs="Arial"/>
+          <w:color w:val="000000" w:themeColor="text1"/>
+          <w:sz w:val="22"/>
+          <w:szCs w:val="22"/>
+          <w:lang w:val="en-US"/>
+        </w:rPr>
+      </w:r>
+      <w:proofErr w:type="spellStart"/>
+      <w:r>
+        <w:rPr>
+          <w:rFonts w:ascii="Arial" w:hAnsi="Arial" w:cs="Arial"/>
+          <w:color w:val="000000" w:themeColor="text1"/>
+          <w:sz w:val="22"/>
+          <w:szCs w:val="22"/>
+          <w:lang w:val="en-US"/>
+        </w:rPr>
+      </w:r>
+      <w:proofErr w:type="spellEnd"/>
+      <w:r>
+        <w:rPr>
+          <w:rFonts w:ascii="Arial" w:hAnsi="Arial" w:cs="Arial"/>
+          <w:color w:val="000000" w:themeColor="text1"/>
+          <w:sz w:val="22"/>
+          <w:szCs w:val="22"/>
+          <w:lang w:val="en-US"/>
+        </w:rPr>
+      </w:r>
+      <w:proofErr w:type="spellStart"/>
+      <w:r>
+        <w:rPr>
+          <w:rFonts w:ascii="Arial" w:hAnsi="Arial" w:cs="Arial"/>
+          <w:color w:val="000000" w:themeColor="text1"/>
+          <w:sz w:val="22"/>
+          <w:szCs w:val="22"/>
+          <w:lang w:val="en-US"/>
+        </w:rPr>
+      </w:r>
+      <w:proofErr w:type="spellEnd"/>
+      <w:r>
+        <w:rPr>
+          <w:rFonts w:ascii="Arial" w:hAnsi="Arial" w:cs="Arial"/>
+          <w:color w:val="000000" w:themeColor="text1"/>
+          <w:sz w:val="22"/>
+          <w:szCs w:val="22"/>
+          <w:lang w:val="en-US"/>
+        </w:rPr>
+      </w:r>
+      <w:proofErr w:type="spellStart"/>
+      <w:r>
+        <w:rPr>
+          <w:rFonts w:ascii="Arial" w:hAnsi="Arial" w:cs="Arial"/>
+          <w:color w:val="000000" w:themeColor="text1"/>
+          <w:sz w:val="22"/>
+          <w:szCs w:val="22"/>
+          <w:lang w:val="en-US"/>
+        </w:rPr>
+      </w:r>
+      <w:proofErr w:type="spellEnd"/>
+      <w:r>
+        <w:rPr>
+          <w:rFonts w:ascii="Arial" w:hAnsi="Arial" w:cs="Arial"/>
+          <w:color w:val="000000" w:themeColor="text1"/>
+          <w:sz w:val="22"/>
+          <w:szCs w:val="22"/>
+          <w:lang w:val="en-US"/>
+        </w:rPr>
+      </w:r>
+      <w:proofErr w:type="spellStart"/>
+      <w:r>
+        <w:rPr>
+          <w:rFonts w:ascii="Arial" w:hAnsi="Arial" w:cs="Arial"/>
+          <w:color w:val="000000" w:themeColor="text1"/>
+          <w:sz w:val="22"/>
+          <w:szCs w:val="22"/>
+          <w:lang w:val="en-US"/>
+        </w:rPr>
+      </w:r>
+      <w:proofErr w:type="spellEnd"/>
+      <w:r>
+        <w:rPr>
+          <w:rFonts w:ascii="Arial" w:hAnsi="Arial" w:cs="Arial"/>
+          <w:color w:val="000000" w:themeColor="text1"/>
+          <w:sz w:val="22"/>
+          <w:szCs w:val="22"/>
+          <w:lang w:val="en-US"/>
+        </w:rPr>
+      </w:r>
+      <w:proofErr w:type="spellStart"/>
+      <w:r>
+        <w:rPr>
+          <w:rFonts w:ascii="Arial" w:hAnsi="Arial" w:cs="Arial"/>
+          <w:color w:val="000000" w:themeColor="text1"/>
+          <w:sz w:val="22"/>
+          <w:szCs w:val="22"/>
+          <w:lang w:val="en-US"/>
+        </w:rPr>
+      </w:r>
+      <w:proofErr w:type="spellEnd"/>
+      <w:r>
+        <w:rPr>
+          <w:rFonts w:ascii="Arial" w:hAnsi="Arial" w:cs="Arial"/>
+          <w:color w:val="000000" w:themeColor="text1"/>
+          <w:sz w:val="22"/>
+          <w:szCs w:val="22"/>
+          <w:lang w:val="en-US"/>
+        </w:rPr>
+      </w:r>
+      <w:proofErr w:type="spellStart"/>
+      <w:r>
+        <w:rPr>
+          <w:rFonts w:ascii="Arial" w:hAnsi="Arial" w:cs="Arial"/>
+          <w:color w:val="000000" w:themeColor="text1"/>
+          <w:sz w:val="22"/>
+          <w:szCs w:val="22"/>
+          <w:lang w:val="en-US"/>
+        </w:rPr>
+      </w:r>
+      <w:proofErr w:type="spellEnd"/>
+      <w:r>
+        <w:rPr>
+          <w:rFonts w:ascii="Arial" w:hAnsi="Arial" w:cs="Arial"/>
+          <w:color w:val="000000" w:themeColor="text1"/>
+          <w:sz w:val="22"/>
+          <w:szCs w:val="22"/>
+          <w:lang w:val="en-US"/>
+        </w:rPr>
+      </w:r>
+      <w:proofErr w:type="spellStart"/>
+      <w:r>
+        <w:rPr>
+          <w:rFonts w:ascii="Arial" w:hAnsi="Arial" w:cs="Arial"/>
+          <w:color w:val="000000" w:themeColor="text1"/>
+          <w:sz w:val="22"/>
+          <w:szCs w:val="22"/>
+          <w:lang w:val="en-US"/>
+        </w:rPr>
+      </w:r>
+      <w:proofErr w:type="spellEnd"/>
+      <w:r>
+        <w:rPr>
+          <w:rFonts w:ascii="Arial" w:hAnsi="Arial" w:cs="Arial"/>
+          <w:color w:val="000000" w:themeColor="text1"/>
+          <w:sz w:val="22"/>
+          <w:szCs w:val="22"/>
+          <w:lang w:val="en-US"/>
+        </w:rPr>
+      </w:r>
+      <w:r>
+        <w:rPr>
+          <w:rFonts w:ascii="Arial" w:hAnsi="Arial" w:cs="Arial"/>
+          <w:color w:val="000000" w:themeColor="text1"/>
+          <w:sz w:val="22"/>
+          <w:szCs w:val="22"/>
+          <w:lang w:val="en-US"/>
+        </w:rPr>
+      </w:r>
+      <w:proofErr w:type="spellStart"/>
+      <w:r>
+        <w:rPr>
+          <w:rFonts w:ascii="Arial" w:hAnsi="Arial" w:cs="Arial"/>
+          <w:color w:val="000000" w:themeColor="text1"/>
+          <w:sz w:val="22"/>
+          <w:szCs w:val="22"/>
+          <w:lang w:val="en-US"/>
+        </w:rPr>
+      </w:r>
+      <w:proofErr w:type="spellEnd"/>
+      <w:r>
+        <w:rPr>
+          <w:rFonts w:ascii="Arial" w:hAnsi="Arial" w:cs="Arial"/>
+          <w:color w:val="000000" w:themeColor="text1"/>
+          <w:sz w:val="22"/>
+          <w:szCs w:val="22"/>
+          <w:lang w:val="en-US"/>
+        </w:rPr>
+      </w:r>
+      <w:proofErr w:type="spellStart"/>
+      <w:r>
+        <w:rPr>
+          <w:rFonts w:ascii="Arial" w:hAnsi="Arial" w:cs="Arial"/>
+          <w:color w:val="000000" w:themeColor="text1"/>
+          <w:sz w:val="22"/>
+          <w:szCs w:val="22"/>
+          <w:lang w:val="en-US"/>
+        </w:rPr>
+      </w:r>
+      <w:proofErr w:type="spellEnd"/>
+      <w:r>
+        <w:rPr>
+          <w:rFonts w:ascii="Arial" w:hAnsi="Arial" w:cs="Arial"/>
+          <w:color w:val="000000" w:themeColor="text1"/>
+          <w:sz w:val="22"/>
+          <w:szCs w:val="22"/>
+          <w:lang w:val="en-US"/>
+        </w:rPr>
+      </w:r>
+      <w:proofErr w:type="spellStart"/>
+      <w:r>
+        <w:rPr>
+          <w:rFonts w:ascii="Arial" w:hAnsi="Arial" w:cs="Arial"/>
+          <w:color w:val="000000" w:themeColor="text1"/>
+          <w:sz w:val="22"/>
+          <w:szCs w:val="22"/>
+          <w:lang w:val="en-US"/>
+        </w:rPr>
+      </w:r>
+      <w:proofErr w:type="spellEnd"/>
+      <w:r>
+        <w:rPr>
+          <w:rFonts w:ascii="Arial" w:hAnsi="Arial" w:cs="Arial"/>
+          <w:color w:val="000000" w:themeColor="text1"/>
+          <w:sz w:val="22"/>
+          <w:szCs w:val="22"/>
+          <w:lang w:val="en-US"/>
+        </w:rPr>
+      </w:r>
+      <w:proofErr w:type="spellStart"/>
+      <w:r>
+        <w:rPr>
+          <w:rFonts w:ascii="Arial" w:hAnsi="Arial" w:cs="Arial"/>
+          <w:color w:val="000000" w:themeColor="text1"/>
+          <w:sz w:val="22"/>
+          <w:szCs w:val="22"/>
+          <w:lang w:val="en-US"/>
+        </w:rPr>
+      </w:r>
+      <w:proofErr w:type="spellEnd"/>
+      <w:r>
+        <w:rPr>
+          <w:rFonts w:ascii="Arial" w:hAnsi="Arial" w:cs="Arial"/>
+          <w:color w:val="000000" w:themeColor="text1"/>
+          <w:sz w:val="22"/>
+          <w:szCs w:val="22"/>
+          <w:lang w:val="en-US"/>
+        </w:rPr>
+      </w:r>
+      <w:proofErr w:type="spellStart"/>
+      <w:r>
+        <w:rPr>
+          <w:rFonts w:ascii="Arial" w:hAnsi="Arial" w:cs="Arial"/>
+          <w:color w:val="000000" w:themeColor="text1"/>
+          <w:sz w:val="22"/>
+          <w:szCs w:val="22"/>
+          <w:lang w:val="en-US"/>
+        </w:rPr>
+      </w:r>
+      <w:proofErr w:type="spellEnd"/>
+      <w:r>
+        <w:rPr>
+          <w:rFonts w:ascii="Arial" w:hAnsi="Arial" w:cs="Arial"/>
+          <w:color w:val="000000" w:themeColor="text1"/>
+          <w:sz w:val="22"/>
+          <w:szCs w:val="22"/>
+          <w:lang w:val="en-US"/>
+        </w:rPr>
+      </w:r>
+      <w:proofErr w:type="spellStart"/>
+      <w:r>
+        <w:rPr>
+          <w:rFonts w:ascii="Arial" w:hAnsi="Arial" w:cs="Arial"/>
+          <w:color w:val="000000" w:themeColor="text1"/>
+          <w:sz w:val="22"/>
+          <w:szCs w:val="22"/>
+          <w:lang w:val="en-US"/>
+        </w:rPr>
+      </w:r>
+      <w:proofErr w:type="spellEnd"/>
+      <w:r>
+        <w:rPr>
+          <w:rFonts w:ascii="Arial" w:hAnsi="Arial" w:cs="Arial"/>
+          <w:color w:val="000000" w:themeColor="text1"/>
+          <w:sz w:val="22"/>
+          <w:szCs w:val="22"/>
+          <w:lang w:val="en-US"/>
+        </w:rPr>
+      </w:r>
+      <w:proofErr w:type="spellStart"/>
+      <w:r>
+        <w:rPr>
+          <w:rFonts w:ascii="Arial" w:hAnsi="Arial" w:cs="Arial"/>
+          <w:color w:val="000000" w:themeColor="text1"/>
+          <w:sz w:val="22"/>
+          <w:szCs w:val="22"/>
+          <w:lang w:val="en-US"/>
+        </w:rPr>
+      </w:r>
+      <w:proofErr w:type="spellEnd"/>
+      <w:r>
+        <w:rPr>
+          <w:rFonts w:ascii="Arial" w:hAnsi="Arial" w:cs="Arial"/>
+          <w:color w:val="000000" w:themeColor="text1"/>
+          <w:sz w:val="22"/>
+          <w:szCs w:val="22"/>
+          <w:lang w:val="en-US"/>
+        </w:rPr>
+      </w:r>
+      <w:proofErr w:type="spellStart"/>
+      <w:r>
+        <w:rPr>
+          <w:rFonts w:ascii="Arial" w:hAnsi="Arial" w:cs="Arial"/>
+          <w:color w:val="000000" w:themeColor="text1"/>
+          <w:sz w:val="22"/>
+          <w:szCs w:val="22"/>
+          <w:lang w:val="en-US"/>
+        </w:rPr>
+      </w:r>
+      <w:proofErr w:type="spellEnd"/>
+      <w:r>
+        <w:rPr>
+          <w:rFonts w:ascii="Arial" w:hAnsi="Arial" w:cs="Arial"/>
+          <w:color w:val="000000" w:themeColor="text1"/>
+          <w:sz w:val="22"/>
+          <w:szCs w:val="22"/>
+          <w:lang w:val="en-US"/>
+        </w:rPr>
+      </w:r>
+      <w:proofErr w:type="spellStart"/>
+      <w:r>
+        <w:rPr>
+          <w:rFonts w:ascii="Arial" w:hAnsi="Arial" w:cs="Arial"/>
+          <w:color w:val="000000" w:themeColor="text1"/>
+          <w:sz w:val="22"/>
+          <w:szCs w:val="22"/>
+          <w:lang w:val="en-US"/>
+        </w:rPr>
+      </w:r>
+      <w:proofErr w:type="spellEnd"/>
+      <w:r>
+        <w:rPr>
+          <w:rFonts w:ascii="Arial" w:hAnsi="Arial" w:cs="Arial"/>
+          <w:color w:val="000000" w:themeColor="text1"/>
+          <w:sz w:val="22"/>
+          <w:szCs w:val="22"/>
+          <w:lang w:val="en-US"/>
+        </w:rPr>
+      </w:r>
+      <w:proofErr w:type="spellStart"/>
+      <w:r>
+        <w:rPr>
+          <w:rFonts w:ascii="Arial" w:hAnsi="Arial" w:cs="Arial"/>
+          <w:color w:val="000000" w:themeColor="text1"/>
+          <w:sz w:val="22"/>
+          <w:szCs w:val="22"/>
+          <w:lang w:val="en-US"/>
+        </w:rPr>
+      </w:r>
+      <w:proofErr w:type="spellEnd"/>
+      <w:r>
+        <w:rPr>
+          <w:rFonts w:ascii="Arial" w:hAnsi="Arial" w:cs="Arial"/>
+          <w:color w:val="000000" w:themeColor="text1"/>
+          <w:sz w:val="22"/>
+          <w:szCs w:val="22"/>
+          <w:lang w:val="en-US"/>
+        </w:rPr>
+      </w:r>
+      <w:proofErr w:type="spellStart"/>
+      <w:r>
+        <w:rPr>
+          <w:rFonts w:ascii="Arial" w:hAnsi="Arial" w:cs="Arial"/>
+          <w:color w:val="000000" w:themeColor="text1"/>
+          <w:sz w:val="22"/>
+          <w:szCs w:val="22"/>
+          <w:lang w:val="en-US"/>
+        </w:rPr>
+      </w:r>
+      <w:proofErr w:type="spellEnd"/>
+      <w:r>
+        <w:rPr>
+          <w:rFonts w:ascii="Arial" w:hAnsi="Arial" w:cs="Arial"/>
+          <w:color w:val="000000" w:themeColor="text1"/>
+          <w:sz w:val="22"/>
+          <w:szCs w:val="22"/>
+          <w:lang w:val="en-US"/>
+        </w:rPr>
+      </w:r>
+      <w:proofErr w:type="spellStart"/>
+      <w:r>
+        <w:rPr>
+          <w:rFonts w:ascii="Arial" w:hAnsi="Arial" w:cs="Arial"/>
+          <w:color w:val="000000" w:themeColor="text1"/>
+          <w:sz w:val="22"/>
+          <w:szCs w:val="22"/>
+          <w:lang w:val="en-US"/>
+        </w:rPr>
+      </w:r>
+      <w:proofErr w:type="spellEnd"/>
+      <w:r>
+        <w:rPr>
+          <w:rFonts w:ascii="Arial" w:hAnsi="Arial" w:cs="Arial"/>
+          <w:color w:val="000000" w:themeColor="text1"/>
+          <w:sz w:val="22"/>
+          <w:szCs w:val="22"/>
+          <w:lang w:val="en-US"/>
+        </w:rPr>
+      </w:r>
+      <w:proofErr w:type="spellStart"/>
+      <w:r>
+        <w:rPr>
+          <w:rFonts w:ascii="Arial" w:hAnsi="Arial" w:cs="Arial"/>
+          <w:color w:val="000000" w:themeColor="text1"/>
+          <w:sz w:val="22"/>
+          <w:szCs w:val="22"/>
+          <w:lang w:val="en-US"/>
+        </w:rPr>
+      </w:r>
+      <w:proofErr w:type="spellEnd"/>
+      <w:r>
+        <w:rPr>
+          <w:rFonts w:ascii="Arial" w:hAnsi="Arial" w:cs="Arial"/>
+          <w:color w:val="000000" w:themeColor="text1"/>
+          <w:sz w:val="22"/>
+          <w:szCs w:val="22"/>
+          <w:lang w:val="en-US"/>
+        </w:rPr>
       </w:r>
     </w:p>
     <w:p>
@@ -2916,77 +2848,70 @@
           <w:sz w:val="22"/>
           <w:szCs w:val="22"/>
         </w:rPr>
-        <w:t>Adapun</w:t>
-      </w:r>
-      <w:proofErr w:type="spellEnd"/>
-      <w:r>
-        <w:rPr>
-          <w:rFonts w:ascii="Arial" w:hAnsi="Arial" w:cs="Arial"/>
-          <w:color w:val="000000" w:themeColor="text1"/>
-          <w:sz w:val="22"/>
-          <w:szCs w:val="22"/>
-        </w:rPr>
-        <w:t xml:space="preserve"> </w:t>
-      </w:r>
-      <w:proofErr w:type="spellStart"/>
-      <w:r>
-        <w:rPr>
-          <w:rFonts w:ascii="Arial" w:hAnsi="Arial" w:cs="Arial"/>
-          <w:color w:val="000000" w:themeColor="text1"/>
-          <w:sz w:val="22"/>
-          <w:szCs w:val="22"/>
-        </w:rPr>
-        <w:t>tujuan</w:t>
-      </w:r>
-      <w:proofErr w:type="spellEnd"/>
-      <w:r>
-        <w:rPr>
-          <w:rFonts w:ascii="Arial" w:hAnsi="Arial" w:cs="Arial"/>
-          <w:color w:val="000000" w:themeColor="text1"/>
-          <w:sz w:val="22"/>
-          <w:szCs w:val="22"/>
-        </w:rPr>
-        <w:t xml:space="preserve"> </w:t>
-      </w:r>
-      <w:proofErr w:type="spellStart"/>
-      <w:r>
-        <w:rPr>
-          <w:rFonts w:ascii="Arial" w:hAnsi="Arial" w:cs="Arial"/>
-          <w:color w:val="000000" w:themeColor="text1"/>
-          <w:sz w:val="22"/>
-          <w:szCs w:val="22"/>
-        </w:rPr>
-        <w:t>kegiatan</w:t>
-      </w:r>
-      <w:proofErr w:type="spellEnd"/>
-      <w:r>
-        <w:rPr>
-          <w:rFonts w:ascii="Arial" w:hAnsi="Arial" w:cs="Arial"/>
-          <w:color w:val="000000" w:themeColor="text1"/>
-          <w:sz w:val="22"/>
-          <w:szCs w:val="22"/>
-        </w:rPr>
-        <w:t xml:space="preserve"> </w:t>
-      </w:r>
-      <w:proofErr w:type="spellStart"/>
-      <w:r>
-        <w:rPr>
-          <w:rFonts w:ascii="Arial" w:hAnsi="Arial" w:cs="Arial"/>
-          <w:color w:val="000000" w:themeColor="text1"/>
-          <w:sz w:val="22"/>
-          <w:szCs w:val="22"/>
-        </w:rPr>
-        <w:t>adalah</w:t>
-      </w:r>
-      <w:proofErr w:type="spellEnd"/>
-      <w:r>
-        <w:rPr>
-          <w:rFonts w:ascii="Arial" w:hAnsi="Arial" w:cs="Arial"/>
-          <w:color w:val="000000" w:themeColor="text1"/>
-          <w:sz w:val="22"/>
-          <w:szCs w:val="22"/>
-        </w:rPr>
-        <w:t>:</w:t>
+        <w:t>Adapun tujuan kegiatan ini adalah sebagai berikut:</w:t>
+      </w:r>
+      <w:proofErr w:type="spellEnd"/>
+      <w:r>
+        <w:rPr>
+          <w:rFonts w:ascii="Arial" w:hAnsi="Arial" w:cs="Arial"/>
+          <w:color w:val="000000" w:themeColor="text1"/>
+          <w:sz w:val="22"/>
+          <w:szCs w:val="22"/>
+        </w:rPr>
+      </w:r>
+      <w:proofErr w:type="spellStart"/>
+      <w:r>
+        <w:rPr>
+          <w:rFonts w:ascii="Arial" w:hAnsi="Arial" w:cs="Arial"/>
+          <w:color w:val="000000" w:themeColor="text1"/>
+          <w:sz w:val="22"/>
+          <w:szCs w:val="22"/>
+        </w:rPr>
+      </w:r>
+      <w:proofErr w:type="spellEnd"/>
+      <w:r>
+        <w:rPr>
+          <w:rFonts w:ascii="Arial" w:hAnsi="Arial" w:cs="Arial"/>
+          <w:color w:val="000000" w:themeColor="text1"/>
+          <w:sz w:val="22"/>
+          <w:szCs w:val="22"/>
+        </w:rPr>
+      </w:r>
+      <w:proofErr w:type="spellStart"/>
+      <w:r>
+        <w:rPr>
+          <w:rFonts w:ascii="Arial" w:hAnsi="Arial" w:cs="Arial"/>
+          <w:color w:val="000000" w:themeColor="text1"/>
+          <w:sz w:val="22"/>
+          <w:szCs w:val="22"/>
+        </w:rPr>
+      </w:r>
+      <w:proofErr w:type="spellEnd"/>
+      <w:r>
+        <w:rPr>
+          <w:rFonts w:ascii="Arial" w:hAnsi="Arial" w:cs="Arial"/>
+          <w:color w:val="000000" w:themeColor="text1"/>
+          <w:sz w:val="22"/>
+          <w:szCs w:val="22"/>
+        </w:rPr>
+      </w:r>
+      <w:proofErr w:type="spellStart"/>
+      <w:r>
+        <w:rPr>
+          <w:rFonts w:ascii="Arial" w:hAnsi="Arial" w:cs="Arial"/>
+          <w:color w:val="000000" w:themeColor="text1"/>
+          <w:sz w:val="22"/>
+          <w:szCs w:val="22"/>
+        </w:rPr>
+      </w:r>
+      <w:proofErr w:type="spellEnd"/>
+      <w:r>
+        <w:rPr>
+          <w:rFonts w:ascii="Arial" w:hAnsi="Arial" w:cs="Arial"/>
+          <w:color w:val="000000" w:themeColor="text1"/>
+          <w:sz w:val="22"/>
+          <w:szCs w:val="22"/>
+        </w:rPr>
       </w:r>
     </w:p>
     <w:p>
@@ -3894,7 +3819,7 @@
           <w:szCs w:val="22"/>
           <w:lang w:val="sv-SE"/>
         </w:rPr>
-        <w:t>Ruang lingkup kegiatan meliputi:</w:t>
+        <w:t>Ruang lingkup kegiatan ini meliputi:</w:t>
       </w:r>
     </w:p>
     <w:p>
@@ -4068,7 +3993,7 @@
           <w:szCs w:val="22"/>
           <w:lang w:val="sv-SE"/>
         </w:rPr>
-        <w:t xml:space="preserve">Kegiatan Monitoring dan Evaluasi dilaksanakan berdasarkan </w:t>
+        <w:t>Kegiatan Monitoring dan Evaluasi dilaksanakan berdasarkan Surat Perintah Tugas Nomor: CK07/T/Bpbpk11/2026/1883 tanggal 18 September 2026</w:t>
       </w:r>
       <w:r>
         <w:rPr>
@@ -4080,7 +4005,6 @@
           <w:szCs w:val="22"/>
           <w:lang w:val="sv-SE"/>
         </w:rPr>
-        <w:t>Surat Perintah Tugas Nomor :</w:t>
       </w:r>
       <w:r>
         <w:rPr>
@@ -4092,7 +4016,6 @@
           <w:szCs w:val="22"/>
           <w:lang w:val="sv-SE"/>
         </w:rPr>
-        <w:t xml:space="preserve"> </w:t>
       </w:r>
       <w:r>
         <w:rPr>
@@ -4104,7 +4027,6 @@
           <w:szCs w:val="22"/>
           <w:lang w:val="sv-SE"/>
         </w:rPr>
-        <w:t>CK07/T/Bpbpk11/2026/1</w:t>
       </w:r>
       <w:r>
         <w:rPr>
@@ -4116,7 +4038,6 @@
           <w:szCs w:val="22"/>
           <w:lang w:val="sv-SE"/>
         </w:rPr>
-        <w:t>883</w:t>
       </w:r>
       <w:r>
         <w:rPr>
@@ -4128,7 +4049,6 @@
           <w:szCs w:val="22"/>
           <w:lang w:val="sv-SE"/>
         </w:rPr>
-        <w:t xml:space="preserve"> tanggal </w:t>
       </w:r>
       <w:r>
         <w:rPr>
@@ -4140,7 +4060,6 @@
           <w:szCs w:val="22"/>
           <w:lang w:val="sv-SE"/>
         </w:rPr>
-        <w:t>18 September 2026</w:t>
       </w:r>
     </w:p>
     <w:p>
@@ -4189,7 +4108,7 @@
           <w:szCs w:val="22"/>
           <w:lang w:val="sv-SE"/>
         </w:rPr>
-        <w:t>Kegiatan Monitoring dan Evaluasi dilaksanakan melalui pemantauan langsung di lapangan dengan melakukan pengamatan, pemeriksaan, dan verifikasi terhadap pelaksanaan kegiatan Pamsimas. Pemantauan bertujuan untuk memastikan bahwa pelaksanaan kegiatan di lokasi sesuai dengan dokumen perencanaan, target yang telah ditetapkan, serta kondisi dan kebutuhan masyarakat penerima manfaat.</w:t>
+        <w:t>Kegiatan Monitoring dan Evaluasi dilaksanakan melalui pemantauan langsung di lapangan dengan melakukan pengamatan, pemeriksaan, dan verifikasi terhadap pelaksanaan Kegiatan Pamsimas. Pemantauan bertujuan untuk memastikan bahwa pelaksanaan kegiatan di lokasi sesuai dengan dokumen perencanaan, target yang telah ditetapkan, serta kondisi dan kebutuhan masyarakat penerima manfaat.</w:t>
       </w:r>
     </w:p>
     <w:p>
@@ -4289,157 +4208,142 @@
           <w:sz w:val="22"/>
           <w:szCs w:val="22"/>
         </w:rPr>
-        <w:t>Pemantauan</w:t>
-      </w:r>
-      <w:proofErr w:type="spellEnd"/>
-      <w:r>
-        <w:rPr>
-          <w:rFonts w:ascii="Arial" w:hAnsi="Arial" w:cs="Arial"/>
-          <w:color w:val="000000" w:themeColor="text1"/>
-          <w:sz w:val="22"/>
-          <w:szCs w:val="22"/>
-        </w:rPr>
-        <w:t xml:space="preserve"> </w:t>
-      </w:r>
-      <w:proofErr w:type="spellStart"/>
-      <w:r>
-        <w:rPr>
-          <w:rFonts w:ascii="Arial" w:hAnsi="Arial" w:cs="Arial"/>
-          <w:color w:val="000000" w:themeColor="text1"/>
-          <w:sz w:val="22"/>
-          <w:szCs w:val="22"/>
-        </w:rPr>
-        <w:t>langsung</w:t>
-      </w:r>
-      <w:proofErr w:type="spellEnd"/>
-      <w:r>
-        <w:rPr>
-          <w:rFonts w:ascii="Arial" w:hAnsi="Arial" w:cs="Arial"/>
-          <w:color w:val="000000" w:themeColor="text1"/>
-          <w:sz w:val="22"/>
-          <w:szCs w:val="22"/>
-        </w:rPr>
-        <w:t xml:space="preserve"> </w:t>
-      </w:r>
-      <w:proofErr w:type="spellStart"/>
-      <w:r>
-        <w:rPr>
-          <w:rFonts w:ascii="Arial" w:hAnsi="Arial" w:cs="Arial"/>
-          <w:color w:val="000000" w:themeColor="text1"/>
-          <w:sz w:val="22"/>
-          <w:szCs w:val="22"/>
-        </w:rPr>
-        <w:t>kondisi</w:t>
-      </w:r>
-      <w:proofErr w:type="spellEnd"/>
-      <w:r>
-        <w:rPr>
-          <w:rFonts w:ascii="Arial" w:hAnsi="Arial" w:cs="Arial"/>
-          <w:color w:val="000000" w:themeColor="text1"/>
-          <w:sz w:val="22"/>
-          <w:szCs w:val="22"/>
-        </w:rPr>
-        <w:t xml:space="preserve"> dan </w:t>
-      </w:r>
-      <w:proofErr w:type="spellStart"/>
-      <w:r>
-        <w:rPr>
-          <w:rFonts w:ascii="Arial" w:hAnsi="Arial" w:cs="Arial"/>
-          <w:color w:val="000000" w:themeColor="text1"/>
-          <w:sz w:val="22"/>
-          <w:szCs w:val="22"/>
-        </w:rPr>
-        <w:t>kemajuan</w:t>
-      </w:r>
-      <w:proofErr w:type="spellEnd"/>
-      <w:r>
-        <w:rPr>
-          <w:rFonts w:ascii="Arial" w:hAnsi="Arial" w:cs="Arial"/>
-          <w:color w:val="000000" w:themeColor="text1"/>
-          <w:sz w:val="22"/>
-          <w:szCs w:val="22"/>
-        </w:rPr>
-        <w:t xml:space="preserve"> </w:t>
-      </w:r>
-      <w:proofErr w:type="spellStart"/>
-      <w:r>
-        <w:rPr>
-          <w:rFonts w:ascii="Arial" w:hAnsi="Arial" w:cs="Arial"/>
-          <w:color w:val="000000" w:themeColor="text1"/>
-          <w:sz w:val="22"/>
-          <w:szCs w:val="22"/>
-        </w:rPr>
-        <w:t>pelaksanaan</w:t>
-      </w:r>
-      <w:proofErr w:type="spellEnd"/>
-      <w:r>
-        <w:rPr>
-          <w:rFonts w:ascii="Arial" w:hAnsi="Arial" w:cs="Arial"/>
-          <w:color w:val="000000" w:themeColor="text1"/>
-          <w:sz w:val="22"/>
-          <w:szCs w:val="22"/>
-        </w:rPr>
-        <w:t xml:space="preserve"> </w:t>
-      </w:r>
-      <w:proofErr w:type="spellStart"/>
-      <w:r>
-        <w:rPr>
-          <w:rFonts w:ascii="Arial" w:hAnsi="Arial" w:cs="Arial"/>
-          <w:color w:val="000000" w:themeColor="text1"/>
-          <w:sz w:val="22"/>
-          <w:szCs w:val="22"/>
-        </w:rPr>
-        <w:t>kegiatan</w:t>
-      </w:r>
-      <w:proofErr w:type="spellEnd"/>
-      <w:r>
-        <w:rPr>
-          <w:rFonts w:ascii="Arial" w:hAnsi="Arial" w:cs="Arial"/>
-          <w:color w:val="000000" w:themeColor="text1"/>
-          <w:sz w:val="22"/>
-          <w:szCs w:val="22"/>
-        </w:rPr>
-        <w:t xml:space="preserve"> di </w:t>
-      </w:r>
-      <w:proofErr w:type="spellStart"/>
-      <w:r>
-        <w:rPr>
-          <w:rFonts w:ascii="Arial" w:hAnsi="Arial" w:cs="Arial"/>
-          <w:color w:val="000000" w:themeColor="text1"/>
-          <w:sz w:val="22"/>
-          <w:szCs w:val="22"/>
-        </w:rPr>
-        <w:t>lokasi</w:t>
-      </w:r>
-      <w:proofErr w:type="spellEnd"/>
-      <w:r>
-        <w:rPr>
-          <w:rFonts w:ascii="Arial" w:hAnsi="Arial" w:cs="Arial"/>
-          <w:color w:val="000000" w:themeColor="text1"/>
-          <w:sz w:val="22"/>
-          <w:szCs w:val="22"/>
-        </w:rPr>
-        <w:t xml:space="preserve"> </w:t>
-      </w:r>
-      <w:proofErr w:type="spellStart"/>
-      <w:r>
-        <w:rPr>
-          <w:rFonts w:ascii="Arial" w:hAnsi="Arial" w:cs="Arial"/>
-          <w:color w:val="000000" w:themeColor="text1"/>
-          <w:sz w:val="22"/>
-          <w:szCs w:val="22"/>
-        </w:rPr>
-        <w:t>Pamsimas</w:t>
-      </w:r>
-      <w:proofErr w:type="spellEnd"/>
-      <w:r>
-        <w:rPr>
-          <w:rFonts w:ascii="Arial" w:hAnsi="Arial" w:cs="Arial"/>
-          <w:color w:val="000000" w:themeColor="text1"/>
-          <w:sz w:val="22"/>
-          <w:szCs w:val="22"/>
-        </w:rPr>
-        <w:t>.</w:t>
+        <w:t>Pemantauan langsung kondisi dan kemajuan pelaksanaan kegiatan di lokasi Kegiatan Pamsimas.</w:t>
+      </w:r>
+      <w:proofErr w:type="spellEnd"/>
+      <w:r>
+        <w:rPr>
+          <w:rFonts w:ascii="Arial" w:hAnsi="Arial" w:cs="Arial"/>
+          <w:color w:val="000000" w:themeColor="text1"/>
+          <w:sz w:val="22"/>
+          <w:szCs w:val="22"/>
+        </w:rPr>
+      </w:r>
+      <w:proofErr w:type="spellStart"/>
+      <w:r>
+        <w:rPr>
+          <w:rFonts w:ascii="Arial" w:hAnsi="Arial" w:cs="Arial"/>
+          <w:color w:val="000000" w:themeColor="text1"/>
+          <w:sz w:val="22"/>
+          <w:szCs w:val="22"/>
+        </w:rPr>
+      </w:r>
+      <w:proofErr w:type="spellEnd"/>
+      <w:r>
+        <w:rPr>
+          <w:rFonts w:ascii="Arial" w:hAnsi="Arial" w:cs="Arial"/>
+          <w:color w:val="000000" w:themeColor="text1"/>
+          <w:sz w:val="22"/>
+          <w:szCs w:val="22"/>
+        </w:rPr>
+      </w:r>
+      <w:proofErr w:type="spellStart"/>
+      <w:r>
+        <w:rPr>
+          <w:rFonts w:ascii="Arial" w:hAnsi="Arial" w:cs="Arial"/>
+          <w:color w:val="000000" w:themeColor="text1"/>
+          <w:sz w:val="22"/>
+          <w:szCs w:val="22"/>
+        </w:rPr>
+      </w:r>
+      <w:proofErr w:type="spellEnd"/>
+      <w:r>
+        <w:rPr>
+          <w:rFonts w:ascii="Arial" w:hAnsi="Arial" w:cs="Arial"/>
+          <w:color w:val="000000" w:themeColor="text1"/>
+          <w:sz w:val="22"/>
+          <w:szCs w:val="22"/>
+        </w:rPr>
+      </w:r>
+      <w:proofErr w:type="spellStart"/>
+      <w:r>
+        <w:rPr>
+          <w:rFonts w:ascii="Arial" w:hAnsi="Arial" w:cs="Arial"/>
+          <w:color w:val="000000" w:themeColor="text1"/>
+          <w:sz w:val="22"/>
+          <w:szCs w:val="22"/>
+        </w:rPr>
+      </w:r>
+      <w:proofErr w:type="spellEnd"/>
+      <w:r>
+        <w:rPr>
+          <w:rFonts w:ascii="Arial" w:hAnsi="Arial" w:cs="Arial"/>
+          <w:color w:val="000000" w:themeColor="text1"/>
+          <w:sz w:val="22"/>
+          <w:szCs w:val="22"/>
+        </w:rPr>
+      </w:r>
+      <w:proofErr w:type="spellStart"/>
+      <w:r>
+        <w:rPr>
+          <w:rFonts w:ascii="Arial" w:hAnsi="Arial" w:cs="Arial"/>
+          <w:color w:val="000000" w:themeColor="text1"/>
+          <w:sz w:val="22"/>
+          <w:szCs w:val="22"/>
+        </w:rPr>
+      </w:r>
+      <w:proofErr w:type="spellEnd"/>
+      <w:r>
+        <w:rPr>
+          <w:rFonts w:ascii="Arial" w:hAnsi="Arial" w:cs="Arial"/>
+          <w:color w:val="000000" w:themeColor="text1"/>
+          <w:sz w:val="22"/>
+          <w:szCs w:val="22"/>
+        </w:rPr>
+      </w:r>
+      <w:proofErr w:type="spellStart"/>
+      <w:r>
+        <w:rPr>
+          <w:rFonts w:ascii="Arial" w:hAnsi="Arial" w:cs="Arial"/>
+          <w:color w:val="000000" w:themeColor="text1"/>
+          <w:sz w:val="22"/>
+          <w:szCs w:val="22"/>
+        </w:rPr>
+      </w:r>
+      <w:proofErr w:type="spellEnd"/>
+      <w:r>
+        <w:rPr>
+          <w:rFonts w:ascii="Arial" w:hAnsi="Arial" w:cs="Arial"/>
+          <w:color w:val="000000" w:themeColor="text1"/>
+          <w:sz w:val="22"/>
+          <w:szCs w:val="22"/>
+        </w:rPr>
+      </w:r>
+      <w:proofErr w:type="spellStart"/>
+      <w:r>
+        <w:rPr>
+          <w:rFonts w:ascii="Arial" w:hAnsi="Arial" w:cs="Arial"/>
+          <w:color w:val="000000" w:themeColor="text1"/>
+          <w:sz w:val="22"/>
+          <w:szCs w:val="22"/>
+        </w:rPr>
+      </w:r>
+      <w:proofErr w:type="spellEnd"/>
+      <w:r>
+        <w:rPr>
+          <w:rFonts w:ascii="Arial" w:hAnsi="Arial" w:cs="Arial"/>
+          <w:color w:val="000000" w:themeColor="text1"/>
+          <w:sz w:val="22"/>
+          <w:szCs w:val="22"/>
+        </w:rPr>
+      </w:r>
+      <w:proofErr w:type="spellStart"/>
+      <w:r>
+        <w:rPr>
+          <w:rFonts w:ascii="Arial" w:hAnsi="Arial" w:cs="Arial"/>
+          <w:color w:val="000000" w:themeColor="text1"/>
+          <w:sz w:val="22"/>
+          <w:szCs w:val="22"/>
+        </w:rPr>
+      </w:r>
+      <w:proofErr w:type="spellEnd"/>
+      <w:r>
+        <w:rPr>
+          <w:rFonts w:ascii="Arial" w:hAnsi="Arial" w:cs="Arial"/>
+          <w:color w:val="000000" w:themeColor="text1"/>
+          <w:sz w:val="22"/>
+          <w:szCs w:val="22"/>
+        </w:rPr>
       </w:r>
     </w:p>
     <w:p>
@@ -4467,7 +4371,7 @@
           <w:szCs w:val="22"/>
           <w:lang w:val="sv-SE"/>
         </w:rPr>
-        <w:t xml:space="preserve">Monitoring dan evaluasi progres pelaksanaan Program Pamsimas TA 2026 di Kabupaten </w:t>
+        <w:t>Monitoring dan Evaluasi progres pelaksanaan Kegiatan Pamsimas TA 2026 di Kabupaten Magelang.</w:t>
       </w:r>
       <w:r>
         <w:rPr>
@@ -4477,7 +4381,6 @@
           <w:szCs w:val="22"/>
           <w:lang w:val="sv-SE"/>
         </w:rPr>
-        <w:t>Magelang</w:t>
       </w:r>
       <w:r>
         <w:rPr>
@@ -4487,7 +4390,6 @@
           <w:szCs w:val="22"/>
           <w:lang w:val="sv-SE"/>
         </w:rPr>
-        <w:t>;</w:t>
       </w:r>
     </w:p>
     <w:p>
@@ -4620,7 +4522,7 @@
           <w:bCs/>
           <w:lang w:val="sv-SE"/>
         </w:rPr>
-        <w:t xml:space="preserve">Adapun data umum kegiatan SAM di Desa Baleagung adalah sebagai berikut : </w:t>
+        <w:t>Adapun data umum kegiatan sarana air minum (SAM) di Desa Baleagung adalah sebagai berikut:</w:t>
       </w:r>
     </w:p>
     <w:p>
@@ -4695,7 +4597,7 @@
           <w:bCs/>
           <w:lang w:val="sv-SE"/>
         </w:rPr>
-        <w:t>Panjang Jaringan Perpipaan</w:t>
+        <w:t>Panjang jaringan perpipaan 3.282 m, sesuai dengan RAB dan hasil DED yang telah disetujui. Opsi mata air pompa ini dipilih berdasarkan hasil kajian teknis lapangan, yang menunjukkan bahwa sumber mata air yang tersedia memiliki potensi debit yang cukup, tetapi secara topografis memerlukan bantuan pompa untuk mengalirkan air menuju reservoir, yang selanjutnya didistribusikan secara gravitasi kepada 146 SR target.</w:t>
       </w:r>
       <w:r>
         <w:rPr>
@@ -4703,7 +4605,6 @@
           <w:bCs/>
           <w:lang w:val="sv-SE"/>
         </w:rPr>
-        <w:t xml:space="preserve"> 3282</w:t>
       </w:r>
       <w:r>
         <w:rPr>
@@ -4711,7 +4612,6 @@
           <w:bCs/>
           <w:lang w:val="sv-SE"/>
         </w:rPr>
-        <w:t xml:space="preserve"> m, s</w:t>
       </w:r>
       <w:r>
         <w:rPr>
@@ -4719,7 +4619,6 @@
           <w:bCs/>
           <w:lang w:val="sv-SE"/>
         </w:rPr>
-        <w:t>esuai dengan RAB dan hasil DED yang telah disetujui</w:t>
       </w:r>
       <w:r>
         <w:rPr>
@@ -4727,7 +4626,6 @@
           <w:bCs/>
           <w:lang w:val="sv-SE"/>
         </w:rPr>
-        <w:t xml:space="preserve"> </w:t>
       </w:r>
       <w:r>
         <w:rPr>
@@ -4735,7 +4633,6 @@
           <w:bCs/>
           <w:lang w:val="sv-SE"/>
         </w:rPr>
-        <w:t>Opsi Mata Air Pompa ini dipilih berdasarkan hasil kajian teknis lapangan, di mana sumber mata air yang tersedia memiliki potensi debit yang cukup, namun secara topografi memerlukan bantuan pompa untuk dapat mengalirkan air menuju reservoir dan selanjutnya didistribusikan secara gravitasi kepada 146 SR target.</w:t>
       </w:r>
     </w:p>
     <w:p>
@@ -4761,8 +4658,7 @@
           <w:bCs/>
           <w:lang w:val="sv-SE"/>
         </w:rPr>
-        <w:lastRenderedPageBreak/>
-        <w:t>Progres Fisik telah mencapai 19,24%. Capaian ini meliputi pekerjaan persiapan lahan, pekerjaan konstruksi awal pada bangunan penangkap mata air (bronkaptering), sebagian pekerjaan ground reservoir, serta pekerjaan galian untuk jaringan perpipaan yang telah mulai dilaksanakan oleh tenaga kerja lokal dari Pokmas</w:t>
+        <w:t>Progres fisik telah mencapai 19,24%. Capaian ini meliputi pekerjaan persiapan lahan, pekerjaan konstruksi awal pada bangunan penangkap mata air (broncaptering), sebagian pekerjaan ground reservoir, serta pekerjaan galian untuk jaringan perpipaan yang telah mulai dilaksanakan oleh tenaga kerja lokal dari kelompok masyarakat (pokmas).</w:t>
       </w:r>
     </w:p>
     <w:p>
@@ -4787,7 +4683,7 @@
           <w:bCs/>
           <w:lang w:val="sv-SE"/>
         </w:rPr>
-        <w:t>Progres Keuangan telah mencapai 19,18%. Angka ini selaras dengan progres fisik yang ada, di mana penyerapan anggaran digunakan untuk pembayaran upah tukang dan pekerja, pembelian material lokal, serta proses pengadaan barang</w:t>
+        <w:t>Progres keuangan telah mencapai 19,18%. Angka ini selaras dengan progres fisik yang berjalan, dengan penyerapan anggaran yang dialokasikan untuk pembayaran upah tukang dan pekerja, pembelian material lokal, serta proses pengadaan barang.</w:t>
       </w:r>
       <w:r>
         <w:rPr>
@@ -4795,7 +4691,6 @@
           <w:bCs/>
           <w:lang w:val="sv-SE"/>
         </w:rPr>
-        <w:t xml:space="preserve">. </w:t>
       </w:r>
     </w:p>
     <w:p>
@@ -4820,7 +4715,7 @@
           <w:bCs/>
           <w:lang w:val="sv-SE"/>
         </w:rPr>
-        <w:t xml:space="preserve"> Administrasi keuangan dikelola secara tertib oleh Bendahara Pokmas dengan pendampingan dari FM dan AAK, dan saat ini sedang dalam proses penyusunan Laporan Pertanggungjawaban (LPJ) untuk tahapan selanjutnya.</w:t>
+        <w:t>Administrasi keuangan dikelola secara tertib oleh bendahara pokmas dengan pendampingan fasilitator masyarakat (FM) dan asisten administrasi keuangan (AAK), serta saat ini dalam proses penyusunan laporan pertanggungjawaban (LPJ) untuk tahapan selanjutnya.</w:t>
       </w:r>
     </w:p>
     <w:p>
@@ -4845,7 +4740,7 @@
           <w:bCs/>
           <w:lang w:val="sv-SE"/>
         </w:rPr>
-        <w:t>Pengadaan Pipa dan aksesoris jaringan telah dilaksanakan pada tanggal 27 Agustus 2026.Pengadaan Sambungan Rumah (SR) telah dilaksanakan pada tanggal 26 Agustus 2026.</w:t>
+        <w:t>Pengadaan pipa dan aksesori jaringan telah dilaksanakan pada tanggal 27 Agustus 2026. Pengadaan sambungan rumah (SR) telah dilaksanakan pada tanggal 26 Agustus 2026.</w:t>
       </w:r>
     </w:p>
     <w:p>
@@ -4870,7 +4765,7 @@
           <w:bCs/>
           <w:lang w:val="sv-SE"/>
         </w:rPr>
-        <w:t>Kegiatan non fisik yang sedang dilakukan koordinasi/persiapan promosi kesehatan, yang direncanakan dilakukan di dusun Baleagung.</w:t>
+        <w:t>Kegiatan nonfisik yang sedang dikoordinasikan dan dipersiapkan adalah promosi kesehatan yang direncanakan bertempat di Dusun Baleagung.</w:t>
       </w:r>
     </w:p>
     <w:p>
@@ -4889,7 +4784,7 @@
           <w:bCs/>
           <w:lang w:val="sv-SE"/>
         </w:rPr>
-        <w:t xml:space="preserve">Kendala yang dialami di lapangan : </w:t>
+        <w:t>Kendala yang dialami di lapangan:</w:t>
       </w:r>
     </w:p>
     <w:p>
@@ -4913,7 +4808,7 @@
           <w:bCs/>
           <w:lang w:val="sv-SE"/>
         </w:rPr>
-        <w:t>Opsi sumber air utama yang akan digunakan, mengecil dan dikhawatirkan tidak bisa memenuhi debit yang diinginkan;</w:t>
+        <w:t>Opsi sumber air utama yang akan digunakan mengalami penurunan debit dan dikhawatirkan tidak dapat memenuhi kebutuhan debit rencana.</w:t>
       </w:r>
     </w:p>
     <w:p>
@@ -4937,7 +4832,7 @@
           <w:bCs/>
           <w:lang w:val="sv-SE"/>
         </w:rPr>
-        <w:t xml:space="preserve">Meskipun pipa dan SR sudah datang, sebagian warga belum berkehendak untuk melakukan penanaman pipa, dikarenakan masih menunggu kepastian sumber air yang akan digunakan dapat mengalir; </w:t>
+        <w:t>Meskipun material pipa dan SR telah tiba di lokasi, sebagian warga belum bersedia melakukan penanaman pipa karena masih menunggu kepastian pengaliran sumber air.</w:t>
       </w:r>
     </w:p>
     <w:p>
@@ -4961,7 +4856,7 @@
           <w:bCs/>
           <w:lang w:val="sv-SE"/>
         </w:rPr>
-        <w:t>Sebagaimana diketahui, sebagian besar tukang dan pekerja yang dilibatkan dalam kegiatan ini merupakan warga asli dari dusun setempat di Desa Baleagung. Hal ini memang sejalan dengan prinsip pemberdayaan masyarakat dalam program Pamsimas, namun di sisi lain menimbulkan konsekuensi ketika di dusun tersebut terdapat kegiatan Adat atau hajatan masyarakat.</w:t>
+        <w:t>Sebagaimana diketahui, sebagian besar tukang dan pekerja yang dilibatkan dalam kegiatan ini merupakan warga asli dari dusun setempat di Desa Baleagung. Hal ini memang sejalan dengan prinsip pemberdayaan masyarakat dalam Kegiatan Pamsimas, tetapi di sisi lain berdampak pada ketersediaan tenaga kerja ketika di dusun setempat terdapat kegiatan adat atau hajatan masyarakat.</w:t>
       </w:r>
     </w:p>
     <w:p>
@@ -4980,7 +4875,7 @@
           <w:bCs/>
           <w:lang w:val="sv-SE"/>
         </w:rPr>
-        <w:t>Rencan tindak lanjut :</w:t>
+        <w:t>Rencana tindak lanjut:</w:t>
       </w:r>
     </w:p>
     <w:p>
@@ -5004,7 +4899,7 @@
           <w:bCs/>
           <w:lang w:val="sv-SE"/>
         </w:rPr>
-        <w:t xml:space="preserve">Untuk rencana tindak lanjut ke depan, Pokmas akan berupaya mempercepat pekerjaan instalasi pipa dan SR yang materialnya sudah tersedia, sembari tetap menyelesaikan pekerjaan </w:t>
+        <w:t>Sebagai rencana tindak lanjut, pokmas berupaya mempercepat pekerjaan instalasi pipa dan SR yang materialnya telah tersedia, sembari menyelesaikan pekerjaan pada bangunan penangkap mata air.</w:t>
       </w:r>
       <w:r>
         <w:rPr>
@@ -5012,7 +4907,6 @@
           <w:bCs/>
           <w:lang w:val="sv-SE"/>
         </w:rPr>
-        <w:t>pada bangunan penangkap mata air;</w:t>
       </w:r>
     </w:p>
     <w:p>
@@ -5036,7 +4930,7 @@
           <w:bCs/>
           <w:lang w:val="sv-SE"/>
         </w:rPr>
-        <w:t xml:space="preserve">Melakukan koordinasi dan komunikasi intensif dengan </w:t>
+        <w:t>Melakukan koordinasi dan komunikasi intensif dengan Pj. Kepala Desa guna menggerakkan masyarakat dalam kegiatan kerja bakti penanaman pipa.</w:t>
       </w:r>
       <w:r>
         <w:rPr>
@@ -5044,7 +4938,6 @@
           <w:bCs/>
           <w:lang w:val="sv-SE"/>
         </w:rPr>
-        <w:t xml:space="preserve">PJ Kepala Desa, untuk dapat menggerakkan masyarakat kerja bakti untuk penanaman pipa; </w:t>
       </w:r>
     </w:p>
     <w:p>

</xml_diff>

<commit_message>
feat(report): enforce bold section headings and auto-adjust report date logic
</commit_message>
<xml_diff>
--- a/app/templates/template_laporan_monev.docx
+++ b/app/templates/template_laporan_monev.docx
@@ -135,6 +135,7 @@
       <w:r>
         <w:rPr>
           <w:rFonts w:ascii="Arial" w:hAnsi="Arial" w:cs="Arial"/>
+          <w:b/>
           <w:color w:val="000000" w:themeColor="text1"/>
           <w:sz w:val="22"/>
           <w:szCs w:val="22"/>
@@ -158,6 +159,7 @@
       <w:r>
         <w:rPr>
           <w:rFonts w:ascii="Arial" w:hAnsi="Arial" w:cs="Arial"/>
+          <w:b/>
           <w:color w:val="000000" w:themeColor="text1"/>
           <w:sz w:val="22"/>
           <w:szCs w:val="22"/>
@@ -168,6 +170,7 @@
       <w:r>
         <w:rPr>
           <w:rFonts w:ascii="Arial" w:hAnsi="Arial" w:cs="Arial"/>
+          <w:b/>
           <w:color w:val="000000" w:themeColor="text1"/>
           <w:sz w:val="22"/>
           <w:szCs w:val="22"/>
@@ -2489,6 +2492,7 @@
       <w:r>
         <w:rPr>
           <w:rFonts w:ascii="Arial" w:hAnsi="Arial" w:cs="Arial"/>
+          <w:b/>
           <w:color w:val="000000" w:themeColor="text1"/>
           <w:sz w:val="22"/>
           <w:szCs w:val="22"/>
@@ -2499,6 +2503,7 @@
       <w:r>
         <w:rPr>
           <w:rFonts w:ascii="Arial" w:hAnsi="Arial" w:cs="Arial"/>
+          <w:b/>
           <w:color w:val="000000" w:themeColor="text1"/>
           <w:sz w:val="22"/>
           <w:szCs w:val="22"/>
@@ -2509,6 +2514,7 @@
       <w:r>
         <w:rPr>
           <w:rFonts w:ascii="Arial" w:hAnsi="Arial" w:cs="Arial"/>
+          <w:b/>
           <w:color w:val="000000" w:themeColor="text1"/>
           <w:sz w:val="22"/>
           <w:szCs w:val="22"/>
@@ -2519,6 +2525,7 @@
       <w:r>
         <w:rPr>
           <w:rFonts w:ascii="Arial" w:hAnsi="Arial" w:cs="Arial"/>
+          <w:b/>
           <w:color w:val="000000" w:themeColor="text1"/>
           <w:sz w:val="22"/>
           <w:szCs w:val="22"/>
@@ -3789,6 +3796,7 @@
       <w:r>
         <w:rPr>
           <w:rFonts w:ascii="Arial" w:hAnsi="Arial" w:cs="Arial"/>
+          <w:b/>
           <w:color w:val="000000" w:themeColor="text1"/>
           <w:sz w:val="22"/>
           <w:szCs w:val="22"/>
@@ -3962,6 +3970,7 @@
       <w:r>
         <w:rPr>
           <w:rFonts w:ascii="Arial" w:hAnsi="Arial" w:cs="Arial"/>
+          <w:b/>
           <w:color w:val="000000" w:themeColor="text1"/>
           <w:sz w:val="22"/>
           <w:szCs w:val="22"/>
@@ -4079,6 +4088,7 @@
       <w:r>
         <w:rPr>
           <w:rFonts w:ascii="Arial" w:hAnsi="Arial" w:cs="Arial"/>
+          <w:b/>
           <w:color w:val="000000" w:themeColor="text1"/>
           <w:sz w:val="22"/>
           <w:szCs w:val="22"/>
@@ -4492,6 +4502,7 @@
       <w:r>
         <w:rPr>
           <w:rFonts w:ascii="Arial" w:hAnsi="Arial" w:cs="Arial"/>
+          <w:b/>
           <w:color w:val="auto"/>
           <w:sz w:val="22"/>
           <w:szCs w:val="22"/>
@@ -8656,6 +8667,7 @@
     </w:pPr>
     <w:rPr>
       <w:rFonts w:asciiTheme="majorHAnsi" w:eastAsiaTheme="majorEastAsia" w:hAnsiTheme="majorHAnsi" w:cstheme="majorBidi"/>
+      <w:b/>
       <w:color w:val="0F4761" w:themeColor="accent1" w:themeShade="BF"/>
       <w:sz w:val="40"/>
       <w:szCs w:val="40"/>
@@ -8678,6 +8690,7 @@
     </w:pPr>
     <w:rPr>
       <w:rFonts w:asciiTheme="majorHAnsi" w:eastAsiaTheme="majorEastAsia" w:hAnsiTheme="majorHAnsi" w:cstheme="majorBidi"/>
+      <w:b/>
       <w:color w:val="0F4761" w:themeColor="accent1" w:themeShade="BF"/>
       <w:sz w:val="32"/>
       <w:szCs w:val="32"/>

</xml_diff>